<commit_message>
Add order in template
</commit_message>
<xml_diff>
--- a/public/files/contract_order_in_template.docx
+++ b/public/files/contract_order_in_template.docx
@@ -364,23 +364,13 @@
                                   <w:szCs w:val="18"/>
                                 </w:rPr>
                               </w:pPr>
-                              <w:proofErr w:type="spellStart"/>
                               <w:r>
                                 <w:rPr>
                                   <w:rFonts w:ascii="Sylfaen" w:hAnsi="Sylfaen"/>
                                   <w:sz w:val="18"/>
                                   <w:szCs w:val="18"/>
                                 </w:rPr>
-                                <w:t>Ամսաթիվ</w:t>
-                              </w:r>
-                              <w:proofErr w:type="spellEnd"/>
-                              <w:r>
-                                <w:rPr>
-                                  <w:rFonts w:ascii="Sylfaen" w:hAnsi="Sylfaen"/>
-                                  <w:sz w:val="18"/>
-                                  <w:szCs w:val="18"/>
-                                </w:rPr>
-                                <w:t xml:space="preserve">՝ </w:t>
+                                <w:t xml:space="preserve">Ամսաթիվ՝ </w:t>
                               </w:r>
                               <w:r>
                                 <w:rPr>
@@ -528,7 +518,6 @@
                                     <w:szCs w:val="15"/>
                                   </w:rPr>
                                 </w:pPr>
-                                <w:proofErr w:type="spellStart"/>
                                 <w:r>
                                   <w:rPr>
                                     <w:rFonts w:ascii="Sylfaen" w:hAnsi="Sylfaen"/>
@@ -537,7 +526,6 @@
                                   </w:rPr>
                                   <w:t>հաշվեհամար</w:t>
                                 </w:r>
-                                <w:proofErr w:type="spellEnd"/>
                               </w:p>
                             </w:txbxContent>
                           </wps:txbx>
@@ -713,7 +701,6 @@
                                     <w:szCs w:val="15"/>
                                   </w:rPr>
                                 </w:pPr>
-                                <w:proofErr w:type="spellStart"/>
                                 <w:r>
                                   <w:rPr>
                                     <w:rFonts w:ascii="Sylfaen" w:hAnsi="Sylfaen"/>
@@ -722,7 +709,6 @@
                                   </w:rPr>
                                   <w:t>գումար</w:t>
                                 </w:r>
-                                <w:proofErr w:type="spellEnd"/>
                               </w:p>
                             </w:txbxContent>
                           </wps:txbx>
@@ -761,34 +747,14 @@
                                     <w:szCs w:val="15"/>
                                   </w:rPr>
                                 </w:pPr>
-                                <w:proofErr w:type="spellStart"/>
                                 <w:r>
                                   <w:rPr>
                                     <w:rFonts w:ascii="Sylfaen" w:hAnsi="Sylfaen"/>
                                     <w:sz w:val="15"/>
                                     <w:szCs w:val="15"/>
                                   </w:rPr>
-                                  <w:t>գումարը</w:t>
+                                  <w:t>գումարը բառերով</w:t>
                                 </w:r>
-                                <w:proofErr w:type="spellEnd"/>
-                                <w:r>
-                                  <w:rPr>
-                                    <w:rFonts w:ascii="Sylfaen" w:hAnsi="Sylfaen"/>
-                                    <w:sz w:val="15"/>
-                                    <w:szCs w:val="15"/>
-                                  </w:rPr>
-                                  <w:t xml:space="preserve"> </w:t>
-                                </w:r>
-                                <w:proofErr w:type="spellStart"/>
-                                <w:r>
-                                  <w:rPr>
-                                    <w:rFonts w:ascii="Sylfaen" w:hAnsi="Sylfaen"/>
-                                    <w:sz w:val="15"/>
-                                    <w:szCs w:val="15"/>
-                                  </w:rPr>
-                                  <w:t>բառերով</w:t>
-                                </w:r>
-                                <w:proofErr w:type="spellEnd"/>
                               </w:p>
                             </w:txbxContent>
                           </wps:txbx>
@@ -1826,23 +1792,13 @@
                                   <w:szCs w:val="18"/>
                                 </w:rPr>
                               </w:pPr>
-                              <w:proofErr w:type="spellStart"/>
                               <w:r>
                                 <w:rPr>
                                   <w:rFonts w:ascii="Sylfaen" w:hAnsi="Sylfaen"/>
                                   <w:sz w:val="18"/>
                                   <w:szCs w:val="18"/>
                                 </w:rPr>
-                                <w:t>Ամսաթիվ</w:t>
-                              </w:r>
-                              <w:proofErr w:type="spellEnd"/>
-                              <w:r>
-                                <w:rPr>
-                                  <w:rFonts w:ascii="Sylfaen" w:hAnsi="Sylfaen"/>
-                                  <w:sz w:val="18"/>
-                                  <w:szCs w:val="18"/>
-                                </w:rPr>
-                                <w:t xml:space="preserve">՝ </w:t>
+                                <w:t xml:space="preserve">Ամսաթիվ՝ </w:t>
                               </w:r>
                               <w:r>
                                 <w:rPr>
@@ -1990,7 +1946,6 @@
                                     <w:szCs w:val="15"/>
                                   </w:rPr>
                                 </w:pPr>
-                                <w:proofErr w:type="spellStart"/>
                                 <w:r>
                                   <w:rPr>
                                     <w:rFonts w:ascii="Sylfaen" w:hAnsi="Sylfaen"/>
@@ -1999,7 +1954,6 @@
                                   </w:rPr>
                                   <w:t>հաշվեհամար</w:t>
                                 </w:r>
-                                <w:proofErr w:type="spellEnd"/>
                               </w:p>
                             </w:txbxContent>
                           </wps:txbx>
@@ -2175,7 +2129,6 @@
                                     <w:szCs w:val="15"/>
                                   </w:rPr>
                                 </w:pPr>
-                                <w:proofErr w:type="spellStart"/>
                                 <w:r>
                                   <w:rPr>
                                     <w:rFonts w:ascii="Sylfaen" w:hAnsi="Sylfaen"/>
@@ -2184,7 +2137,6 @@
                                   </w:rPr>
                                   <w:t>գումար</w:t>
                                 </w:r>
-                                <w:proofErr w:type="spellEnd"/>
                               </w:p>
                             </w:txbxContent>
                           </wps:txbx>
@@ -2223,34 +2175,14 @@
                                     <w:szCs w:val="15"/>
                                   </w:rPr>
                                 </w:pPr>
-                                <w:proofErr w:type="spellStart"/>
                                 <w:r>
                                   <w:rPr>
                                     <w:rFonts w:ascii="Sylfaen" w:hAnsi="Sylfaen"/>
                                     <w:sz w:val="15"/>
                                     <w:szCs w:val="15"/>
                                   </w:rPr>
-                                  <w:t>գումարը</w:t>
+                                  <w:t>գումարը բառերով</w:t>
                                 </w:r>
-                                <w:proofErr w:type="spellEnd"/>
-                                <w:r>
-                                  <w:rPr>
-                                    <w:rFonts w:ascii="Sylfaen" w:hAnsi="Sylfaen"/>
-                                    <w:sz w:val="15"/>
-                                    <w:szCs w:val="15"/>
-                                  </w:rPr>
-                                  <w:t xml:space="preserve"> </w:t>
-                                </w:r>
-                                <w:proofErr w:type="spellStart"/>
-                                <w:r>
-                                  <w:rPr>
-                                    <w:rFonts w:ascii="Sylfaen" w:hAnsi="Sylfaen"/>
-                                    <w:sz w:val="15"/>
-                                    <w:szCs w:val="15"/>
-                                  </w:rPr>
-                                  <w:t>բառերով</w:t>
-                                </w:r>
-                                <w:proofErr w:type="spellEnd"/>
                               </w:p>
                             </w:txbxContent>
                           </wps:txbx>
@@ -2747,7 +2679,23 @@
                                 <w:sz w:val="18"/>
                                 <w:szCs w:val="18"/>
                               </w:rPr>
-                              <w:t>${amout1_text}</w:t>
+                              <w:t>${amou</w:t>
+                            </w:r>
+                            <w:r>
+                              <w:rPr>
+                                <w:rFonts w:ascii="Sylfaen" w:hAnsi="Sylfaen"/>
+                                <w:sz w:val="18"/>
+                                <w:szCs w:val="18"/>
+                              </w:rPr>
+                              <w:t>n</w:t>
+                            </w:r>
+                            <w:r>
+                              <w:rPr>
+                                <w:rFonts w:ascii="Sylfaen" w:hAnsi="Sylfaen"/>
+                                <w:sz w:val="18"/>
+                                <w:szCs w:val="18"/>
+                              </w:rPr>
+                              <w:t>t1_text}</w:t>
                             </w:r>
                           </w:p>
                         </w:txbxContent>
@@ -2766,7 +2714,11 @@
           </mc:Choice>
           <mc:Fallback>
             <w:pict>
-              <v:shape w14:anchorId="310CB9DE" id="_x0000_s1067" type="#_x0000_t202" style="position:absolute;left:0;text-align:left;margin-left:294.45pt;margin-top:7.9pt;width:178.45pt;height:23.7pt;z-index:251771392;visibility:visible;mso-wrap-style:square;mso-wrap-distance-left:9pt;mso-wrap-distance-top:0;mso-wrap-distance-right:9pt;mso-wrap-distance-bottom:0;mso-position-horizontal:absolute;mso-position-horizontal-relative:text;mso-position-vertical:absolute;mso-position-vertical-relative:text;v-text-anchor:top" o:gfxdata="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" filled="f" stroked="f" strokeweight=".5pt">
+              <v:shapetype w14:anchorId="310CB9DE" id="_x0000_t202" coordsize="21600,21600" o:spt="202" path="m,l,21600r21600,l21600,xe">
+                <v:stroke joinstyle="miter"/>
+                <v:path gradientshapeok="t" o:connecttype="rect"/>
+              </v:shapetype>
+              <v:shape id="_x0000_s1067" type="#_x0000_t202" style="position:absolute;left:0;text-align:left;margin-left:294.45pt;margin-top:7.9pt;width:178.45pt;height:23.7pt;z-index:251771392;visibility:visible;mso-wrap-style:square;mso-wrap-distance-left:9pt;mso-wrap-distance-top:0;mso-wrap-distance-right:9pt;mso-wrap-distance-bottom:0;mso-position-horizontal:absolute;mso-position-horizontal-relative:text;mso-position-vertical:absolute;mso-position-vertical-relative:text;v-text-anchor:top" o:gfxdata="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" filled="f" stroked="f" strokeweight=".5pt">
                 <v:textbox>
                   <w:txbxContent>
                     <w:p>
@@ -2783,7 +2735,23 @@
                           <w:sz w:val="18"/>
                           <w:szCs w:val="18"/>
                         </w:rPr>
-                        <w:t>${amout1_text}</w:t>
+                        <w:t>${amou</w:t>
+                      </w:r>
+                      <w:r>
+                        <w:rPr>
+                          <w:rFonts w:ascii="Sylfaen" w:hAnsi="Sylfaen"/>
+                          <w:sz w:val="18"/>
+                          <w:szCs w:val="18"/>
+                        </w:rPr>
+                        <w:t>n</w:t>
+                      </w:r>
+                      <w:r>
+                        <w:rPr>
+                          <w:rFonts w:ascii="Sylfaen" w:hAnsi="Sylfaen"/>
+                          <w:sz w:val="18"/>
+                          <w:szCs w:val="18"/>
+                        </w:rPr>
+                        <w:t>t1_text}</w:t>
                       </w:r>
                     </w:p>
                   </w:txbxContent>
@@ -2843,23 +2811,13 @@
         </w:rPr>
         <w:br/>
       </w:r>
-      <w:proofErr w:type="spellStart"/>
       <w:r>
         <w:rPr>
           <w:rFonts w:ascii="Sylfaen" w:hAnsi="Sylfaen"/>
           <w:sz w:val="20"/>
           <w:szCs w:val="20"/>
         </w:rPr>
-        <w:t>Պայմանագրի</w:t>
-      </w:r>
-      <w:proofErr w:type="spellEnd"/>
-      <w:r>
-        <w:rPr>
-          <w:rFonts w:ascii="Sylfaen" w:hAnsi="Sylfaen"/>
-          <w:sz w:val="20"/>
-          <w:szCs w:val="20"/>
-        </w:rPr>
-        <w:t xml:space="preserve"> N </w:t>
+        <w:t xml:space="preserve">Պայմանագրի N </w:t>
       </w:r>
       <w:r>
         <w:rPr>
@@ -2908,23 +2866,13 @@
         </w:rPr>
         <w:br/>
       </w:r>
-      <w:proofErr w:type="spellStart"/>
       <w:r>
         <w:rPr>
           <w:rFonts w:ascii="Sylfaen" w:hAnsi="Sylfaen"/>
           <w:sz w:val="20"/>
           <w:szCs w:val="20"/>
         </w:rPr>
-        <w:t>Նպատակ</w:t>
-      </w:r>
-      <w:proofErr w:type="spellEnd"/>
-      <w:r>
-        <w:rPr>
-          <w:rFonts w:ascii="Sylfaen" w:hAnsi="Sylfaen"/>
-          <w:sz w:val="20"/>
-          <w:szCs w:val="20"/>
-        </w:rPr>
-        <w:t xml:space="preserve"> </w:t>
+        <w:t xml:space="preserve">Նպատակ </w:t>
       </w:r>
       <w:r>
         <w:rPr>
@@ -2933,7 +2881,6 @@
         <w:br/>
         <w:t xml:space="preserve">  </w:t>
       </w:r>
-      <w:proofErr w:type="spellStart"/>
       <w:r>
         <w:rPr>
           <w:rFonts w:ascii="Sylfaen" w:hAnsi="Sylfaen"/>
@@ -2942,31 +2889,8 @@
           <w:i/>
           <w:iCs/>
         </w:rPr>
-        <w:t>Հերթական</w:t>
+        <w:t>Հերթական վճարում</w:t>
       </w:r>
-      <w:proofErr w:type="spellEnd"/>
-      <w:r>
-        <w:rPr>
-          <w:rFonts w:ascii="Sylfaen" w:hAnsi="Sylfaen"/>
-          <w:b/>
-          <w:bCs/>
-          <w:i/>
-          <w:iCs/>
-        </w:rPr>
-        <w:t xml:space="preserve"> </w:t>
-      </w:r>
-      <w:proofErr w:type="spellStart"/>
-      <w:r>
-        <w:rPr>
-          <w:rFonts w:ascii="Sylfaen" w:hAnsi="Sylfaen"/>
-          <w:b/>
-          <w:bCs/>
-          <w:i/>
-          <w:iCs/>
-        </w:rPr>
-        <w:t>վճարում</w:t>
-      </w:r>
-      <w:proofErr w:type="spellEnd"/>
       <w:r>
         <w:rPr>
           <w:rFonts w:ascii="Sylfaen" w:hAnsi="Sylfaen"/>
@@ -2983,7 +2907,6 @@
         </w:rPr>
         <w:br/>
       </w:r>
-      <w:proofErr w:type="spellStart"/>
       <w:r>
         <w:rPr>
           <w:rFonts w:ascii="Sylfaen" w:hAnsi="Sylfaen"/>
@@ -2992,7 +2915,6 @@
         </w:rPr>
         <w:t>Հիմք</w:t>
       </w:r>
-      <w:proofErr w:type="spellEnd"/>
       <w:r>
         <w:rPr>
           <w:rFonts w:ascii="Sylfaen" w:hAnsi="Sylfaen"/>
@@ -3000,7 +2922,6 @@
         <w:br/>
         <w:t xml:space="preserve">  </w:t>
       </w:r>
-      <w:proofErr w:type="spellStart"/>
       <w:r>
         <w:rPr>
           <w:rFonts w:ascii="Sylfaen" w:hAnsi="Sylfaen"/>
@@ -3009,31 +2930,8 @@
           <w:i/>
           <w:iCs/>
         </w:rPr>
-        <w:t>Բանկային</w:t>
+        <w:t>Բանկային քաղվածք</w:t>
       </w:r>
-      <w:proofErr w:type="spellEnd"/>
-      <w:r>
-        <w:rPr>
-          <w:rFonts w:ascii="Sylfaen" w:hAnsi="Sylfaen"/>
-          <w:b/>
-          <w:bCs/>
-          <w:i/>
-          <w:iCs/>
-        </w:rPr>
-        <w:t xml:space="preserve"> </w:t>
-      </w:r>
-      <w:proofErr w:type="spellStart"/>
-      <w:r>
-        <w:rPr>
-          <w:rFonts w:ascii="Sylfaen" w:hAnsi="Sylfaen"/>
-          <w:b/>
-          <w:bCs/>
-          <w:i/>
-          <w:iCs/>
-        </w:rPr>
-        <w:t>քաղվածք</w:t>
-      </w:r>
-      <w:proofErr w:type="spellEnd"/>
       <w:r>
         <w:rPr>
           <w:rFonts w:ascii="Sylfaen" w:hAnsi="Sylfaen"/>
@@ -3049,60 +2947,7 @@
           <w:szCs w:val="20"/>
         </w:rPr>
         <w:br/>
-      </w:r>
-      <w:proofErr w:type="spellStart"/>
-      <w:r>
-        <w:rPr>
-          <w:rFonts w:ascii="Sylfaen" w:hAnsi="Sylfaen"/>
-          <w:sz w:val="20"/>
-          <w:szCs w:val="20"/>
-        </w:rPr>
-        <w:t>Կատարող</w:t>
-      </w:r>
-      <w:proofErr w:type="spellEnd"/>
-      <w:r>
-        <w:rPr>
-          <w:rFonts w:ascii="Sylfaen" w:hAnsi="Sylfaen"/>
-          <w:sz w:val="20"/>
-          <w:szCs w:val="20"/>
-        </w:rPr>
-        <w:t xml:space="preserve">՝ </w:t>
-      </w:r>
-      <w:proofErr w:type="spellStart"/>
-      <w:r>
-        <w:rPr>
-          <w:rFonts w:ascii="Sylfaen" w:hAnsi="Sylfaen"/>
-          <w:sz w:val="20"/>
-          <w:szCs w:val="20"/>
-        </w:rPr>
-        <w:t>Սոնա</w:t>
-      </w:r>
-      <w:proofErr w:type="spellEnd"/>
-      <w:r>
-        <w:rPr>
-          <w:rFonts w:ascii="Sylfaen" w:hAnsi="Sylfaen"/>
-          <w:sz w:val="20"/>
-          <w:szCs w:val="20"/>
-        </w:rPr>
-        <w:t xml:space="preserve"> </w:t>
-      </w:r>
-      <w:proofErr w:type="spellStart"/>
-      <w:r>
-        <w:rPr>
-          <w:rFonts w:ascii="Sylfaen" w:hAnsi="Sylfaen"/>
-          <w:sz w:val="20"/>
-          <w:szCs w:val="20"/>
-        </w:rPr>
-        <w:t>Մինասյան</w:t>
-      </w:r>
-      <w:proofErr w:type="spellEnd"/>
-      <w:r>
-        <w:rPr>
-          <w:rFonts w:ascii="Sylfaen" w:hAnsi="Sylfaen"/>
-          <w:sz w:val="20"/>
-          <w:szCs w:val="20"/>
-        </w:rPr>
-        <w:t xml:space="preserve">                         </w:t>
+        <w:t xml:space="preserve">Կատարող՝ Սոնա Մինասյան                         </w:t>
       </w:r>
       <w:r>
         <w:rPr>
@@ -3208,7 +3053,7 @@
           <w:sz w:val="20"/>
           <w:szCs w:val="20"/>
         </w:rPr>
-        <w:t>receiver</w:t>
+        <w:t>client</w:t>
       </w:r>
       <w:r>
         <w:rPr>
@@ -3234,23 +3079,13 @@
         </w:rPr>
         <w:br/>
       </w:r>
-      <w:proofErr w:type="spellStart"/>
       <w:r>
         <w:rPr>
           <w:rFonts w:ascii="Sylfaen" w:hAnsi="Sylfaen"/>
           <w:sz w:val="20"/>
           <w:szCs w:val="20"/>
         </w:rPr>
-        <w:t>Պայմանագրի</w:t>
-      </w:r>
-      <w:proofErr w:type="spellEnd"/>
-      <w:r>
-        <w:rPr>
-          <w:rFonts w:ascii="Sylfaen" w:hAnsi="Sylfaen"/>
-          <w:sz w:val="20"/>
-          <w:szCs w:val="20"/>
-        </w:rPr>
-        <w:t xml:space="preserve"> N </w:t>
+        <w:t xml:space="preserve">Պայմանագրի N </w:t>
       </w:r>
       <w:r>
         <w:rPr>
@@ -3300,23 +3135,13 @@
         </w:rPr>
         <w:br/>
       </w:r>
-      <w:proofErr w:type="spellStart"/>
       <w:r>
         <w:rPr>
           <w:rFonts w:ascii="Sylfaen" w:hAnsi="Sylfaen"/>
           <w:sz w:val="20"/>
           <w:szCs w:val="20"/>
         </w:rPr>
-        <w:t>Նպատակ</w:t>
-      </w:r>
-      <w:proofErr w:type="spellEnd"/>
-      <w:r>
-        <w:rPr>
-          <w:rFonts w:ascii="Sylfaen" w:hAnsi="Sylfaen"/>
-          <w:sz w:val="20"/>
-          <w:szCs w:val="20"/>
-        </w:rPr>
-        <w:t xml:space="preserve"> </w:t>
+        <w:t xml:space="preserve">Նպատակ </w:t>
       </w:r>
       <w:r>
         <w:rPr>
@@ -3325,7 +3150,6 @@
         <w:br/>
         <w:t xml:space="preserve">  </w:t>
       </w:r>
-      <w:proofErr w:type="spellStart"/>
       <w:r>
         <w:rPr>
           <w:rFonts w:ascii="Sylfaen" w:hAnsi="Sylfaen"/>
@@ -3334,31 +3158,8 @@
           <w:i/>
           <w:iCs/>
         </w:rPr>
-        <w:t>Հերթական</w:t>
+        <w:t>Հերթական վճարում</w:t>
       </w:r>
-      <w:proofErr w:type="spellEnd"/>
-      <w:r>
-        <w:rPr>
-          <w:rFonts w:ascii="Sylfaen" w:hAnsi="Sylfaen"/>
-          <w:b/>
-          <w:bCs/>
-          <w:i/>
-          <w:iCs/>
-        </w:rPr>
-        <w:t xml:space="preserve"> </w:t>
-      </w:r>
-      <w:proofErr w:type="spellStart"/>
-      <w:r>
-        <w:rPr>
-          <w:rFonts w:ascii="Sylfaen" w:hAnsi="Sylfaen"/>
-          <w:b/>
-          <w:bCs/>
-          <w:i/>
-          <w:iCs/>
-        </w:rPr>
-        <w:t>վճարում</w:t>
-      </w:r>
-      <w:proofErr w:type="spellEnd"/>
       <w:r>
         <w:rPr>
           <w:rFonts w:ascii="Sylfaen" w:hAnsi="Sylfaen"/>
@@ -3375,7 +3176,6 @@
         </w:rPr>
         <w:br/>
       </w:r>
-      <w:proofErr w:type="spellStart"/>
       <w:r>
         <w:rPr>
           <w:rFonts w:ascii="Sylfaen" w:hAnsi="Sylfaen"/>
@@ -3384,7 +3184,6 @@
         </w:rPr>
         <w:t>Հիմք</w:t>
       </w:r>
-      <w:proofErr w:type="spellEnd"/>
       <w:r>
         <w:rPr>
           <w:rFonts w:ascii="Sylfaen" w:hAnsi="Sylfaen"/>
@@ -3392,7 +3191,6 @@
         <w:br/>
         <w:t xml:space="preserve">  </w:t>
       </w:r>
-      <w:proofErr w:type="spellStart"/>
       <w:r>
         <w:rPr>
           <w:rFonts w:ascii="Sylfaen" w:hAnsi="Sylfaen"/>
@@ -3401,31 +3199,8 @@
           <w:i/>
           <w:iCs/>
         </w:rPr>
-        <w:t>Բանկային</w:t>
+        <w:t>Բանկային քաղվածք</w:t>
       </w:r>
-      <w:proofErr w:type="spellEnd"/>
-      <w:r>
-        <w:rPr>
-          <w:rFonts w:ascii="Sylfaen" w:hAnsi="Sylfaen"/>
-          <w:b/>
-          <w:bCs/>
-          <w:i/>
-          <w:iCs/>
-        </w:rPr>
-        <w:t xml:space="preserve"> </w:t>
-      </w:r>
-      <w:proofErr w:type="spellStart"/>
-      <w:r>
-        <w:rPr>
-          <w:rFonts w:ascii="Sylfaen" w:hAnsi="Sylfaen"/>
-          <w:b/>
-          <w:bCs/>
-          <w:i/>
-          <w:iCs/>
-        </w:rPr>
-        <w:t>քաղվածք</w:t>
-      </w:r>
-      <w:proofErr w:type="spellEnd"/>
       <w:r>
         <w:rPr>
           <w:rFonts w:ascii="Sylfaen" w:hAnsi="Sylfaen"/>
@@ -3441,60 +3216,7 @@
           <w:szCs w:val="20"/>
         </w:rPr>
         <w:br/>
-      </w:r>
-      <w:proofErr w:type="spellStart"/>
-      <w:r>
-        <w:rPr>
-          <w:rFonts w:ascii="Sylfaen" w:hAnsi="Sylfaen"/>
-          <w:sz w:val="20"/>
-          <w:szCs w:val="20"/>
-        </w:rPr>
-        <w:t>Կատարող</w:t>
-      </w:r>
-      <w:proofErr w:type="spellEnd"/>
-      <w:r>
-        <w:rPr>
-          <w:rFonts w:ascii="Sylfaen" w:hAnsi="Sylfaen"/>
-          <w:sz w:val="20"/>
-          <w:szCs w:val="20"/>
-        </w:rPr>
-        <w:t xml:space="preserve">՝ </w:t>
-      </w:r>
-      <w:proofErr w:type="spellStart"/>
-      <w:r>
-        <w:rPr>
-          <w:rFonts w:ascii="Sylfaen" w:hAnsi="Sylfaen"/>
-          <w:sz w:val="20"/>
-          <w:szCs w:val="20"/>
-        </w:rPr>
-        <w:t>Սոնա</w:t>
-      </w:r>
-      <w:proofErr w:type="spellEnd"/>
-      <w:r>
-        <w:rPr>
-          <w:rFonts w:ascii="Sylfaen" w:hAnsi="Sylfaen"/>
-          <w:sz w:val="20"/>
-          <w:szCs w:val="20"/>
-        </w:rPr>
-        <w:t xml:space="preserve"> </w:t>
-      </w:r>
-      <w:proofErr w:type="spellStart"/>
-      <w:r>
-        <w:rPr>
-          <w:rFonts w:ascii="Sylfaen" w:hAnsi="Sylfaen"/>
-          <w:sz w:val="20"/>
-          <w:szCs w:val="20"/>
-        </w:rPr>
-        <w:t>Մինասյան</w:t>
-      </w:r>
-      <w:proofErr w:type="spellEnd"/>
-      <w:r>
-        <w:rPr>
-          <w:rFonts w:ascii="Sylfaen" w:hAnsi="Sylfaen"/>
-          <w:sz w:val="20"/>
-          <w:szCs w:val="20"/>
-        </w:rPr>
-        <w:t xml:space="preserve">                         </w:t>
+        <w:t xml:space="preserve">Կատարող՝ Սոնա Մինասյան                         </w:t>
       </w:r>
     </w:p>
     <w:sectPr>

</xml_diff>

<commit_message>
fix order templates, round amount , purpose of order
</commit_message>
<xml_diff>
--- a/public/files/contract_order_in_template.docx
+++ b/public/files/contract_order_in_template.docx
@@ -364,13 +364,23 @@
                                   <w:szCs w:val="18"/>
                                 </w:rPr>
                               </w:pPr>
+                              <w:proofErr w:type="spellStart"/>
                               <w:r>
                                 <w:rPr>
                                   <w:rFonts w:ascii="Sylfaen" w:hAnsi="Sylfaen"/>
                                   <w:sz w:val="18"/>
                                   <w:szCs w:val="18"/>
                                 </w:rPr>
-                                <w:t xml:space="preserve">Ամսաթիվ՝ </w:t>
+                                <w:t>Ամսաթիվ</w:t>
+                              </w:r>
+                              <w:proofErr w:type="spellEnd"/>
+                              <w:r>
+                                <w:rPr>
+                                  <w:rFonts w:ascii="Sylfaen" w:hAnsi="Sylfaen"/>
+                                  <w:sz w:val="18"/>
+                                  <w:szCs w:val="18"/>
+                                </w:rPr>
+                                <w:t xml:space="preserve">՝ </w:t>
                               </w:r>
                               <w:r>
                                 <w:rPr>
@@ -518,6 +528,7 @@
                                     <w:szCs w:val="15"/>
                                   </w:rPr>
                                 </w:pPr>
+                                <w:proofErr w:type="spellStart"/>
                                 <w:r>
                                   <w:rPr>
                                     <w:rFonts w:ascii="Sylfaen" w:hAnsi="Sylfaen"/>
@@ -526,6 +537,7 @@
                                   </w:rPr>
                                   <w:t>հաշվեհամար</w:t>
                                 </w:r>
+                                <w:proofErr w:type="spellEnd"/>
                               </w:p>
                             </w:txbxContent>
                           </wps:txbx>
@@ -701,6 +713,7 @@
                                     <w:szCs w:val="15"/>
                                   </w:rPr>
                                 </w:pPr>
+                                <w:proofErr w:type="spellStart"/>
                                 <w:r>
                                   <w:rPr>
                                     <w:rFonts w:ascii="Sylfaen" w:hAnsi="Sylfaen"/>
@@ -709,6 +722,7 @@
                                   </w:rPr>
                                   <w:t>գումար</w:t>
                                 </w:r>
+                                <w:proofErr w:type="spellEnd"/>
                               </w:p>
                             </w:txbxContent>
                           </wps:txbx>
@@ -747,14 +761,34 @@
                                     <w:szCs w:val="15"/>
                                   </w:rPr>
                                 </w:pPr>
+                                <w:proofErr w:type="spellStart"/>
                                 <w:r>
                                   <w:rPr>
                                     <w:rFonts w:ascii="Sylfaen" w:hAnsi="Sylfaen"/>
                                     <w:sz w:val="15"/>
                                     <w:szCs w:val="15"/>
                                   </w:rPr>
-                                  <w:t>գումարը բառերով</w:t>
+                                  <w:t>գումարը</w:t>
                                 </w:r>
+                                <w:proofErr w:type="spellEnd"/>
+                                <w:r>
+                                  <w:rPr>
+                                    <w:rFonts w:ascii="Sylfaen" w:hAnsi="Sylfaen"/>
+                                    <w:sz w:val="15"/>
+                                    <w:szCs w:val="15"/>
+                                  </w:rPr>
+                                  <w:t xml:space="preserve"> </w:t>
+                                </w:r>
+                                <w:proofErr w:type="spellStart"/>
+                                <w:r>
+                                  <w:rPr>
+                                    <w:rFonts w:ascii="Sylfaen" w:hAnsi="Sylfaen"/>
+                                    <w:sz w:val="15"/>
+                                    <w:szCs w:val="15"/>
+                                  </w:rPr>
+                                  <w:t>բառերով</w:t>
+                                </w:r>
+                                <w:proofErr w:type="spellEnd"/>
                               </w:p>
                             </w:txbxContent>
                           </wps:txbx>
@@ -890,13 +924,23 @@
                             <w:szCs w:val="18"/>
                           </w:rPr>
                         </w:pPr>
+                        <w:proofErr w:type="spellStart"/>
                         <w:r>
                           <w:rPr>
                             <w:rFonts w:ascii="Sylfaen" w:hAnsi="Sylfaen"/>
                             <w:sz w:val="18"/>
                             <w:szCs w:val="18"/>
                           </w:rPr>
-                          <w:t xml:space="preserve">Ամսաթիվ՝ </w:t>
+                          <w:t>Ամսաթիվ</w:t>
+                        </w:r>
+                        <w:proofErr w:type="spellEnd"/>
+                        <w:r>
+                          <w:rPr>
+                            <w:rFonts w:ascii="Sylfaen" w:hAnsi="Sylfaen"/>
+                            <w:sz w:val="18"/>
+                            <w:szCs w:val="18"/>
+                          </w:rPr>
+                          <w:t xml:space="preserve">՝ </w:t>
                         </w:r>
                         <w:r>
                           <w:rPr>
@@ -955,6 +999,7 @@
                               <w:szCs w:val="15"/>
                             </w:rPr>
                           </w:pPr>
+                          <w:proofErr w:type="spellStart"/>
                           <w:r>
                             <w:rPr>
                               <w:rFonts w:ascii="Sylfaen" w:hAnsi="Sylfaen"/>
@@ -963,6 +1008,7 @@
                             </w:rPr>
                             <w:t>հաշվեհամար</w:t>
                           </w:r>
+                          <w:proofErr w:type="spellEnd"/>
                         </w:p>
                       </w:txbxContent>
                     </v:textbox>
@@ -1024,6 +1070,7 @@
                               <w:szCs w:val="15"/>
                             </w:rPr>
                           </w:pPr>
+                          <w:proofErr w:type="spellStart"/>
                           <w:r>
                             <w:rPr>
                               <w:rFonts w:ascii="Sylfaen" w:hAnsi="Sylfaen"/>
@@ -1032,6 +1079,7 @@
                             </w:rPr>
                             <w:t>գումար</w:t>
                           </w:r>
+                          <w:proofErr w:type="spellEnd"/>
                         </w:p>
                       </w:txbxContent>
                     </v:textbox>
@@ -1047,14 +1095,34 @@
                               <w:szCs w:val="15"/>
                             </w:rPr>
                           </w:pPr>
+                          <w:proofErr w:type="spellStart"/>
                           <w:r>
                             <w:rPr>
                               <w:rFonts w:ascii="Sylfaen" w:hAnsi="Sylfaen"/>
                               <w:sz w:val="15"/>
                               <w:szCs w:val="15"/>
                             </w:rPr>
-                            <w:t>գումարը բառերով</w:t>
+                            <w:t>գումարը</w:t>
                           </w:r>
+                          <w:proofErr w:type="spellEnd"/>
+                          <w:r>
+                            <w:rPr>
+                              <w:rFonts w:ascii="Sylfaen" w:hAnsi="Sylfaen"/>
+                              <w:sz w:val="15"/>
+                              <w:szCs w:val="15"/>
+                            </w:rPr>
+                            <w:t xml:space="preserve"> </w:t>
+                          </w:r>
+                          <w:proofErr w:type="spellStart"/>
+                          <w:r>
+                            <w:rPr>
+                              <w:rFonts w:ascii="Sylfaen" w:hAnsi="Sylfaen"/>
+                              <w:sz w:val="15"/>
+                              <w:szCs w:val="15"/>
+                            </w:rPr>
+                            <w:t>բառերով</w:t>
+                          </w:r>
+                          <w:proofErr w:type="spellEnd"/>
                         </w:p>
                       </w:txbxContent>
                     </v:textbox>
@@ -1071,71 +1139,7 @@
           <w:noProof/>
         </w:rPr>
         <w:drawing>
-          <wp:anchor distT="0" distB="0" distL="114300" distR="114300" simplePos="0" relativeHeight="251778560" behindDoc="1" locked="0" layoutInCell="1" allowOverlap="1" wp14:anchorId="52F4D787" wp14:editId="1713C67F">
-            <wp:simplePos x="0" y="0"/>
-            <wp:positionH relativeFrom="column">
-              <wp:posOffset>5466519</wp:posOffset>
-            </wp:positionH>
-            <wp:positionV relativeFrom="paragraph">
-              <wp:posOffset>3837305</wp:posOffset>
-            </wp:positionV>
-            <wp:extent cx="643352" cy="1026160"/>
-            <wp:effectExtent l="0" t="0" r="4445" b="0"/>
-            <wp:wrapNone/>
-            <wp:docPr id="2016568890" name="Picture 22"/>
-            <wp:cNvGraphicFramePr>
-              <a:graphicFrameLocks xmlns:a="http://schemas.openxmlformats.org/drawingml/2006/main" noChangeAspect="1"/>
-            </wp:cNvGraphicFramePr>
-            <a:graphic xmlns:a="http://schemas.openxmlformats.org/drawingml/2006/main">
-              <a:graphicData uri="http://schemas.openxmlformats.org/drawingml/2006/picture">
-                <pic:pic xmlns:pic="http://schemas.openxmlformats.org/drawingml/2006/picture">
-                  <pic:nvPicPr>
-                    <pic:cNvPr id="1844926214" name="Picture 1844926214"/>
-                    <pic:cNvPicPr/>
-                  </pic:nvPicPr>
-                  <pic:blipFill rotWithShape="1">
-                    <a:blip r:embed="rId6">
-                      <a:alphaModFix amt="85000"/>
-                    </a:blip>
-                    <a:srcRect r="33648"/>
-                    <a:stretch/>
-                  </pic:blipFill>
-                  <pic:spPr bwMode="auto">
-                    <a:xfrm>
-                      <a:off x="0" y="0"/>
-                      <a:ext cx="643352" cy="1026160"/>
-                    </a:xfrm>
-                    <a:prstGeom prst="rect">
-                      <a:avLst/>
-                    </a:prstGeom>
-                    <a:ln>
-                      <a:noFill/>
-                    </a:ln>
-                    <a:extLst>
-                      <a:ext uri="{53640926-AAD7-44D8-BBD7-CCE9431645EC}">
-                        <a14:shadowObscured xmlns:a14="http://schemas.microsoft.com/office/drawing/2010/main"/>
-                      </a:ext>
-                    </a:extLst>
-                  </pic:spPr>
-                </pic:pic>
-              </a:graphicData>
-            </a:graphic>
-            <wp14:sizeRelH relativeFrom="page">
-              <wp14:pctWidth>0</wp14:pctWidth>
-            </wp14:sizeRelH>
-            <wp14:sizeRelV relativeFrom="page">
-              <wp14:pctHeight>0</wp14:pctHeight>
-            </wp14:sizeRelV>
-          </wp:anchor>
-        </w:drawing>
-      </w:r>
-      <w:r>
-        <w:rPr>
-          <w:rFonts w:ascii="Sylfaen" w:hAnsi="Sylfaen"/>
-          <w:noProof/>
-        </w:rPr>
-        <w:drawing>
-          <wp:anchor distT="0" distB="0" distL="114300" distR="114300" simplePos="0" relativeHeight="251768319" behindDoc="1" locked="0" layoutInCell="1" allowOverlap="1" wp14:anchorId="40CBC428" wp14:editId="6CB2A4E4">
+          <wp:anchor distT="0" distB="0" distL="114300" distR="114300" simplePos="0" relativeHeight="251768319" behindDoc="1" locked="0" layoutInCell="1" allowOverlap="1" wp14:anchorId="40CBC428" wp14:editId="14A24F1E">
             <wp:simplePos x="0" y="0"/>
             <wp:positionH relativeFrom="column">
               <wp:posOffset>5500078</wp:posOffset>
@@ -1242,22 +1246,6 @@
                                 <w:szCs w:val="16"/>
                               </w:rPr>
                             </w:pPr>
-                            <w:r>
-                              <w:rPr>
-                                <w:rFonts w:ascii="Sylfaen" w:hAnsi="Sylfaen"/>
-                                <w:sz w:val="16"/>
-                                <w:szCs w:val="16"/>
-                              </w:rPr>
-                              <w:t>${amount2_text}</w:t>
-                            </w:r>
-                            <w:r>
-                              <w:rPr>
-                                <w:rFonts w:ascii="Sylfaen" w:hAnsi="Sylfaen"/>
-                                <w:sz w:val="16"/>
-                                <w:szCs w:val="16"/>
-                              </w:rPr>
-                              <w:t xml:space="preserve"> ՀՀ դրամ</w:t>
-                            </w:r>
                           </w:p>
                         </w:txbxContent>
                       </wps:txbx>
@@ -1289,22 +1277,6 @@
                           <w:szCs w:val="16"/>
                         </w:rPr>
                       </w:pPr>
-                      <w:r>
-                        <w:rPr>
-                          <w:rFonts w:ascii="Sylfaen" w:hAnsi="Sylfaen"/>
-                          <w:sz w:val="16"/>
-                          <w:szCs w:val="16"/>
-                        </w:rPr>
-                        <w:t>${amount2_text}</w:t>
-                      </w:r>
-                      <w:r>
-                        <w:rPr>
-                          <w:rFonts w:ascii="Sylfaen" w:hAnsi="Sylfaen"/>
-                          <w:sz w:val="16"/>
-                          <w:szCs w:val="16"/>
-                        </w:rPr>
-                        <w:t xml:space="preserve"> ՀՀ դրամ</w:t>
-                      </w:r>
                     </w:p>
                   </w:txbxContent>
                 </v:textbox>
@@ -1362,22 +1334,6 @@
                                 <w:szCs w:val="16"/>
                               </w:rPr>
                             </w:pPr>
-                            <w:r>
-                              <w:rPr>
-                                <w:rFonts w:ascii="Sylfaen" w:hAnsi="Sylfaen"/>
-                                <w:sz w:val="16"/>
-                                <w:szCs w:val="16"/>
-                              </w:rPr>
-                              <w:t>${amount2}</w:t>
-                            </w:r>
-                            <w:r>
-                              <w:rPr>
-                                <w:rFonts w:ascii="Sylfaen" w:hAnsi="Sylfaen"/>
-                                <w:sz w:val="16"/>
-                                <w:szCs w:val="16"/>
-                              </w:rPr>
-                              <w:t xml:space="preserve"> ՀՀ դրամ</w:t>
-                            </w:r>
                           </w:p>
                         </w:txbxContent>
                       </wps:txbx>
@@ -1409,22 +1365,6 @@
                           <w:szCs w:val="16"/>
                         </w:rPr>
                       </w:pPr>
-                      <w:r>
-                        <w:rPr>
-                          <w:rFonts w:ascii="Sylfaen" w:hAnsi="Sylfaen"/>
-                          <w:sz w:val="16"/>
-                          <w:szCs w:val="16"/>
-                        </w:rPr>
-                        <w:t>${amount2}</w:t>
-                      </w:r>
-                      <w:r>
-                        <w:rPr>
-                          <w:rFonts w:ascii="Sylfaen" w:hAnsi="Sylfaen"/>
-                          <w:sz w:val="16"/>
-                          <w:szCs w:val="16"/>
-                        </w:rPr>
-                        <w:t xml:space="preserve"> ՀՀ դրամ</w:t>
-                      </w:r>
                     </w:p>
                   </w:txbxContent>
                 </v:textbox>
@@ -1440,1059 +1380,9 @@
           <w:szCs w:val="20"/>
         </w:rPr>
         <mc:AlternateContent>
-          <mc:Choice Requires="wpg">
-            <w:drawing>
-              <wp:anchor distT="0" distB="0" distL="114300" distR="114300" simplePos="0" relativeHeight="251773440" behindDoc="0" locked="0" layoutInCell="1" allowOverlap="1" wp14:anchorId="362F763F" wp14:editId="5BB0D291">
-                <wp:simplePos x="0" y="0"/>
-                <wp:positionH relativeFrom="column">
-                  <wp:posOffset>-835330</wp:posOffset>
-                </wp:positionH>
-                <wp:positionV relativeFrom="paragraph">
-                  <wp:posOffset>2371725</wp:posOffset>
-                </wp:positionV>
-                <wp:extent cx="7932458" cy="2754696"/>
-                <wp:effectExtent l="38100" t="0" r="0" b="77470"/>
-                <wp:wrapNone/>
-                <wp:docPr id="1906096669" name="Group 20"/>
-                <wp:cNvGraphicFramePr/>
-                <a:graphic xmlns:a="http://schemas.openxmlformats.org/drawingml/2006/main">
-                  <a:graphicData uri="http://schemas.microsoft.com/office/word/2010/wordprocessingGroup">
-                    <wpg:wgp>
-                      <wpg:cNvGrpSpPr/>
-                      <wpg:grpSpPr>
-                        <a:xfrm>
-                          <a:off x="0" y="0"/>
-                          <a:ext cx="7932458" cy="2754696"/>
-                          <a:chOff x="0" y="0"/>
-                          <a:chExt cx="7932458" cy="2754696"/>
-                        </a:xfrm>
-                      </wpg:grpSpPr>
-                      <wps:wsp>
-                        <wps:cNvPr id="1516425610" name="Straight Connector 1"/>
-                        <wps:cNvCnPr/>
-                        <wps:spPr>
-                          <a:xfrm flipH="1">
-                            <a:off x="5384" y="149758"/>
-                            <a:ext cx="31460" cy="2604303"/>
-                          </a:xfrm>
-                          <a:prstGeom prst="line">
-                            <a:avLst/>
-                          </a:prstGeom>
-                          <a:ln w="6350"/>
-                        </wps:spPr>
-                        <wps:style>
-                          <a:lnRef idx="2">
-                            <a:schemeClr val="dk1"/>
-                          </a:lnRef>
-                          <a:fillRef idx="0">
-                            <a:schemeClr val="dk1"/>
-                          </a:fillRef>
-                          <a:effectRef idx="1">
-                            <a:schemeClr val="dk1"/>
-                          </a:effectRef>
-                          <a:fontRef idx="minor">
-                            <a:schemeClr val="tx1"/>
-                          </a:fontRef>
-                        </wps:style>
-                        <wps:bodyPr/>
-                      </wps:wsp>
-                      <wps:wsp>
-                        <wps:cNvPr id="381187655" name="Straight Connector 1"/>
-                        <wps:cNvCnPr/>
-                        <wps:spPr>
-                          <a:xfrm>
-                            <a:off x="6940194" y="135128"/>
-                            <a:ext cx="3368" cy="2619568"/>
-                          </a:xfrm>
-                          <a:prstGeom prst="line">
-                            <a:avLst/>
-                          </a:prstGeom>
-                          <a:ln w="6350"/>
-                        </wps:spPr>
-                        <wps:style>
-                          <a:lnRef idx="2">
-                            <a:schemeClr val="dk1"/>
-                          </a:lnRef>
-                          <a:fillRef idx="0">
-                            <a:schemeClr val="dk1"/>
-                          </a:fillRef>
-                          <a:effectRef idx="1">
-                            <a:schemeClr val="dk1"/>
-                          </a:effectRef>
-                          <a:fontRef idx="minor">
-                            <a:schemeClr val="tx1"/>
-                          </a:fontRef>
-                        </wps:style>
-                        <wps:bodyPr/>
-                      </wps:wsp>
-                      <wps:wsp>
-                        <wps:cNvPr id="899471415" name="Straight Connector 1"/>
-                        <wps:cNvCnPr/>
-                        <wps:spPr>
-                          <a:xfrm flipH="1">
-                            <a:off x="0" y="2753970"/>
-                            <a:ext cx="6937375" cy="0"/>
-                          </a:xfrm>
-                          <a:prstGeom prst="line">
-                            <a:avLst/>
-                          </a:prstGeom>
-                          <a:ln w="6350"/>
-                        </wps:spPr>
-                        <wps:style>
-                          <a:lnRef idx="2">
-                            <a:schemeClr val="dk1"/>
-                          </a:lnRef>
-                          <a:fillRef idx="0">
-                            <a:schemeClr val="dk1"/>
-                          </a:fillRef>
-                          <a:effectRef idx="1">
-                            <a:schemeClr val="dk1"/>
-                          </a:effectRef>
-                          <a:fontRef idx="minor">
-                            <a:schemeClr val="tx1"/>
-                          </a:fontRef>
-                        </wps:style>
-                        <wps:bodyPr/>
-                      </wps:wsp>
-                      <wps:wsp>
-                        <wps:cNvPr id="1185032507" name="Straight Connector 1"/>
-                        <wps:cNvCnPr/>
-                        <wps:spPr>
-                          <a:xfrm flipH="1">
-                            <a:off x="36576" y="149758"/>
-                            <a:ext cx="2184948" cy="0"/>
-                          </a:xfrm>
-                          <a:prstGeom prst="line">
-                            <a:avLst/>
-                          </a:prstGeom>
-                          <a:ln w="6350"/>
-                        </wps:spPr>
-                        <wps:style>
-                          <a:lnRef idx="2">
-                            <a:schemeClr val="dk1"/>
-                          </a:lnRef>
-                          <a:fillRef idx="0">
-                            <a:schemeClr val="dk1"/>
-                          </a:fillRef>
-                          <a:effectRef idx="1">
-                            <a:schemeClr val="dk1"/>
-                          </a:effectRef>
-                          <a:fontRef idx="minor">
-                            <a:schemeClr val="tx1"/>
-                          </a:fontRef>
-                        </wps:style>
-                        <wps:bodyPr/>
-                      </wps:wsp>
-                      <wps:wsp>
-                        <wps:cNvPr id="1688095531" name="Straight Connector 1"/>
-                        <wps:cNvCnPr/>
-                        <wps:spPr>
-                          <a:xfrm flipH="1">
-                            <a:off x="4846116" y="127813"/>
-                            <a:ext cx="2113362" cy="6578"/>
-                          </a:xfrm>
-                          <a:prstGeom prst="line">
-                            <a:avLst/>
-                          </a:prstGeom>
-                          <a:ln w="6350"/>
-                        </wps:spPr>
-                        <wps:style>
-                          <a:lnRef idx="2">
-                            <a:schemeClr val="dk1"/>
-                          </a:lnRef>
-                          <a:fillRef idx="0">
-                            <a:schemeClr val="dk1"/>
-                          </a:fillRef>
-                          <a:effectRef idx="1">
-                            <a:schemeClr val="dk1"/>
-                          </a:effectRef>
-                          <a:fontRef idx="minor">
-                            <a:schemeClr val="tx1"/>
-                          </a:fontRef>
-                        </wps:style>
-                        <wps:bodyPr/>
-                      </wps:wsp>
-                      <wps:wsp>
-                        <wps:cNvPr id="679321287" name="Text Box 3"/>
-                        <wps:cNvSpPr txBox="1"/>
-                        <wps:spPr>
-                          <a:xfrm>
-                            <a:off x="2352040" y="0"/>
-                            <a:ext cx="2487930" cy="300990"/>
-                          </a:xfrm>
-                          <a:prstGeom prst="rect">
-                            <a:avLst/>
-                          </a:prstGeom>
-                          <a:noFill/>
-                          <a:ln w="6350">
-                            <a:noFill/>
-                          </a:ln>
-                        </wps:spPr>
-                        <wps:txbx>
-                          <w:txbxContent>
-                            <w:p>
-                              <w:pPr>
-                                <w:rPr>
-                                  <w:rFonts w:ascii="Sylfaen" w:hAnsi="Sylfaen"/>
-                                  <w:sz w:val="20"/>
-                                  <w:szCs w:val="20"/>
-                                </w:rPr>
-                              </w:pPr>
-                              <w:r>
-                                <w:rPr>
-                                  <w:rFonts w:ascii="Sylfaen" w:hAnsi="Sylfaen"/>
-                                  <w:sz w:val="20"/>
-                                  <w:szCs w:val="20"/>
-                                </w:rPr>
-                                <w:t>ԱՆ</w:t>
-                              </w:r>
-                              <w:r>
-                                <w:rPr>
-                                  <w:rFonts w:ascii="Sylfaen" w:hAnsi="Sylfaen"/>
-                                  <w:sz w:val="20"/>
-                                  <w:szCs w:val="20"/>
-                                </w:rPr>
-                                <w:t xml:space="preserve">ԿԱՆԽԻԿ ՄՈՒՏՔԻ </w:t>
-                              </w:r>
-                              <w:r>
-                                <w:rPr>
-                                  <w:rFonts w:ascii="Sylfaen" w:hAnsi="Sylfaen"/>
-                                  <w:sz w:val="20"/>
-                                  <w:szCs w:val="20"/>
-                                </w:rPr>
-                                <w:t>ԱՆԴՈՐՐԱԳԻՐ</w:t>
-                              </w:r>
-                            </w:p>
-                          </w:txbxContent>
-                        </wps:txbx>
-                        <wps:bodyPr rot="0" spcFirstLastPara="0" vertOverflow="overflow" horzOverflow="overflow" vert="horz" wrap="square" lIns="91440" tIns="45720" rIns="91440" bIns="45720" numCol="1" spcCol="0" rtlCol="0" fromWordArt="0" anchor="t" anchorCtr="0" forceAA="0" compatLnSpc="1">
-                          <a:prstTxWarp prst="textNoShape">
-                            <a:avLst/>
-                          </a:prstTxWarp>
-                          <a:noAutofit/>
-                        </wps:bodyPr>
-                      </wps:wsp>
-                      <wps:wsp>
-                        <wps:cNvPr id="1660120683" name="Text Box 3"/>
-                        <wps:cNvSpPr txBox="1"/>
-                        <wps:spPr>
-                          <a:xfrm>
-                            <a:off x="91643" y="182880"/>
-                            <a:ext cx="2060864" cy="301336"/>
-                          </a:xfrm>
-                          <a:prstGeom prst="rect">
-                            <a:avLst/>
-                          </a:prstGeom>
-                          <a:noFill/>
-                          <a:ln w="6350">
-                            <a:noFill/>
-                          </a:ln>
-                        </wps:spPr>
-                        <wps:txbx>
-                          <w:txbxContent>
-                            <w:p>
-                              <w:pPr>
-                                <w:rPr>
-                                  <w:rFonts w:ascii="Sylfaen" w:hAnsi="Sylfaen"/>
-                                  <w:sz w:val="18"/>
-                                  <w:szCs w:val="18"/>
-                                </w:rPr>
-                              </w:pPr>
-                              <w:r>
-                                <w:rPr>
-                                  <w:rFonts w:ascii="Sylfaen" w:hAnsi="Sylfaen"/>
-                                  <w:sz w:val="18"/>
-                                  <w:szCs w:val="18"/>
-                                </w:rPr>
-                                <w:t xml:space="preserve">«ԱԿՐԵԴԻՏ» ՎՄ ՍՊԸ  </w:t>
-                              </w:r>
-                            </w:p>
-                          </w:txbxContent>
-                        </wps:txbx>
-                        <wps:bodyPr rot="0" spcFirstLastPara="0" vertOverflow="overflow" horzOverflow="overflow" vert="horz" wrap="square" lIns="91440" tIns="45720" rIns="91440" bIns="45720" numCol="1" spcCol="0" rtlCol="0" fromWordArt="0" anchor="t" anchorCtr="0" forceAA="0" compatLnSpc="1">
-                          <a:prstTxWarp prst="textNoShape">
-                            <a:avLst/>
-                          </a:prstTxWarp>
-                          <a:noAutofit/>
-                        </wps:bodyPr>
-                      </wps:wsp>
-                      <wps:wsp>
-                        <wps:cNvPr id="1435607243" name="Text Box 3"/>
-                        <wps:cNvSpPr txBox="1"/>
-                        <wps:spPr>
-                          <a:xfrm>
-                            <a:off x="5665825" y="175565"/>
-                            <a:ext cx="2266633" cy="300990"/>
-                          </a:xfrm>
-                          <a:prstGeom prst="rect">
-                            <a:avLst/>
-                          </a:prstGeom>
-                          <a:noFill/>
-                          <a:ln w="6350">
-                            <a:noFill/>
-                          </a:ln>
-                        </wps:spPr>
-                        <wps:txbx>
-                          <w:txbxContent>
-                            <w:p>
-                              <w:pPr>
-                                <w:rPr>
-                                  <w:rFonts w:ascii="Sylfaen" w:hAnsi="Sylfaen"/>
-                                  <w:sz w:val="18"/>
-                                  <w:szCs w:val="18"/>
-                                </w:rPr>
-                              </w:pPr>
-                              <w:r>
-                                <w:rPr>
-                                  <w:rFonts w:ascii="Sylfaen" w:hAnsi="Sylfaen"/>
-                                  <w:sz w:val="18"/>
-                                  <w:szCs w:val="18"/>
-                                </w:rPr>
-                                <w:t>ՀԱՄԱՐ՝ XX_XXXXX</w:t>
-                              </w:r>
-                            </w:p>
-                          </w:txbxContent>
-                        </wps:txbx>
-                        <wps:bodyPr rot="0" spcFirstLastPara="0" vertOverflow="overflow" horzOverflow="overflow" vert="horz" wrap="square" lIns="91440" tIns="45720" rIns="91440" bIns="45720" numCol="1" spcCol="0" rtlCol="0" fromWordArt="0" anchor="t" anchorCtr="0" forceAA="0" compatLnSpc="1">
-                          <a:prstTxWarp prst="textNoShape">
-                            <a:avLst/>
-                          </a:prstTxWarp>
-                          <a:noAutofit/>
-                        </wps:bodyPr>
-                      </wps:wsp>
-                      <wps:wsp>
-                        <wps:cNvPr id="1423008959" name="Text Box 3"/>
-                        <wps:cNvSpPr txBox="1"/>
-                        <wps:spPr>
-                          <a:xfrm>
-                            <a:off x="5117185" y="2399386"/>
-                            <a:ext cx="2060575" cy="300990"/>
-                          </a:xfrm>
-                          <a:prstGeom prst="rect">
-                            <a:avLst/>
-                          </a:prstGeom>
-                          <a:noFill/>
-                          <a:ln w="6350">
-                            <a:noFill/>
-                          </a:ln>
-                        </wps:spPr>
-                        <wps:txbx>
-                          <w:txbxContent>
-                            <w:p>
-                              <w:pPr>
-                                <w:rPr>
-                                  <w:rFonts w:ascii="Sylfaen" w:hAnsi="Sylfaen"/>
-                                  <w:sz w:val="18"/>
-                                  <w:szCs w:val="18"/>
-                                </w:rPr>
-                              </w:pPr>
-                              <w:r>
-                                <w:rPr>
-                                  <w:rFonts w:ascii="Sylfaen" w:hAnsi="Sylfaen"/>
-                                  <w:sz w:val="18"/>
-                                  <w:szCs w:val="18"/>
-                                </w:rPr>
-                                <w:t xml:space="preserve">Ամսաթիվ՝ </w:t>
-                              </w:r>
-                              <w:r>
-                                <w:rPr>
-                                  <w:rFonts w:ascii="Times New Roman" w:eastAsia="Times New Roman" w:hAnsi="Times New Roman" w:cs="Times New Roman"/>
-                                  <w:color w:val="000000" w:themeColor="text1"/>
-                                  <w:sz w:val="18"/>
-                                  <w:szCs w:val="18"/>
-                                  <w:lang w:val="en-GB"/>
-                                </w:rPr>
-                                <w:t>${date}</w:t>
-                              </w:r>
-                            </w:p>
-                          </w:txbxContent>
-                        </wps:txbx>
-                        <wps:bodyPr rot="0" spcFirstLastPara="0" vertOverflow="overflow" horzOverflow="overflow" vert="horz" wrap="square" lIns="91440" tIns="45720" rIns="91440" bIns="45720" numCol="1" spcCol="0" rtlCol="0" fromWordArt="0" anchor="t" anchorCtr="0" forceAA="0" compatLnSpc="1">
-                          <a:prstTxWarp prst="textNoShape">
-                            <a:avLst/>
-                          </a:prstTxWarp>
-                          <a:noAutofit/>
-                        </wps:bodyPr>
-                      </wps:wsp>
-                      <wps:wsp>
-                        <wps:cNvPr id="1129461720" name="Text Box 3"/>
-                        <wps:cNvSpPr txBox="1"/>
-                        <wps:spPr>
-                          <a:xfrm>
-                            <a:off x="5117185" y="2209190"/>
-                            <a:ext cx="1132114" cy="300990"/>
-                          </a:xfrm>
-                          <a:prstGeom prst="rect">
-                            <a:avLst/>
-                          </a:prstGeom>
-                          <a:noFill/>
-                          <a:ln w="6350">
-                            <a:noFill/>
-                          </a:ln>
-                        </wps:spPr>
-                        <wps:txbx>
-                          <w:txbxContent>
-                            <w:p>
-                              <w:pPr>
-                                <w:rPr>
-                                  <w:rFonts w:ascii="Sylfaen" w:hAnsi="Sylfaen"/>
-                                  <w:sz w:val="18"/>
-                                  <w:szCs w:val="18"/>
-                                </w:rPr>
-                              </w:pPr>
-                              <w:r>
-                                <w:rPr>
-                                  <w:rFonts w:ascii="Sylfaen" w:hAnsi="Sylfaen"/>
-                                  <w:sz w:val="18"/>
-                                  <w:szCs w:val="18"/>
-                                </w:rPr>
-                                <w:t>Կ. Տ.</w:t>
-                              </w:r>
-                            </w:p>
-                          </w:txbxContent>
-                        </wps:txbx>
-                        <wps:bodyPr rot="0" spcFirstLastPara="0" vertOverflow="overflow" horzOverflow="overflow" vert="horz" wrap="square" lIns="91440" tIns="45720" rIns="91440" bIns="45720" numCol="1" spcCol="0" rtlCol="0" fromWordArt="0" anchor="t" anchorCtr="0" forceAA="0" compatLnSpc="1">
-                          <a:prstTxWarp prst="textNoShape">
-                            <a:avLst/>
-                          </a:prstTxWarp>
-                          <a:noAutofit/>
-                        </wps:bodyPr>
-                      </wps:wsp>
-                      <wpg:grpSp>
-                        <wpg:cNvPr id="197062858" name="Group 19"/>
-                        <wpg:cNvGrpSpPr/>
-                        <wpg:grpSpPr>
-                          <a:xfrm>
-                            <a:off x="3112820" y="570586"/>
-                            <a:ext cx="3825807" cy="902453"/>
-                            <a:chOff x="0" y="0"/>
-                            <a:chExt cx="3825807" cy="902453"/>
-                          </a:xfrm>
-                        </wpg:grpSpPr>
-                        <wps:wsp>
-                          <wps:cNvPr id="1728472864" name="Text Box 4"/>
-                          <wps:cNvSpPr txBox="1"/>
-                          <wps:spPr>
-                            <a:xfrm>
-                              <a:off x="1325177" y="478302"/>
-                              <a:ext cx="2500630" cy="328295"/>
-                            </a:xfrm>
-                            <a:prstGeom prst="rect">
-                              <a:avLst/>
-                            </a:prstGeom>
-                            <a:noFill/>
-                            <a:ln w="6350"/>
-                          </wps:spPr>
-                          <wps:style>
-                            <a:lnRef idx="2">
-                              <a:schemeClr val="dk1"/>
-                            </a:lnRef>
-                            <a:fillRef idx="1">
-                              <a:schemeClr val="lt1"/>
-                            </a:fillRef>
-                            <a:effectRef idx="0">
-                              <a:schemeClr val="dk1"/>
-                            </a:effectRef>
-                            <a:fontRef idx="minor">
-                              <a:schemeClr val="dk1"/>
-                            </a:fontRef>
-                          </wps:style>
-                          <wps:txbx>
-                            <w:txbxContent>
-                              <w:p/>
-                            </w:txbxContent>
-                          </wps:txbx>
-                          <wps:bodyPr rot="0" spcFirstLastPara="0" vertOverflow="overflow" horzOverflow="overflow" vert="horz" wrap="square" lIns="91440" tIns="45720" rIns="91440" bIns="45720" numCol="1" spcCol="0" rtlCol="0" fromWordArt="0" anchor="t" anchorCtr="0" forceAA="0" compatLnSpc="1">
-                            <a:prstTxWarp prst="textNoShape">
-                              <a:avLst/>
-                            </a:prstTxWarp>
-                            <a:noAutofit/>
-                          </wps:bodyPr>
-                        </wps:wsp>
-                        <wps:wsp>
-                          <wps:cNvPr id="278411836" name="Text Box 3"/>
-                          <wps:cNvSpPr txBox="1">
-                            <a:spLocks/>
-                          </wps:cNvSpPr>
-                          <wps:spPr>
-                            <a:xfrm>
-                              <a:off x="1539006" y="503624"/>
-                              <a:ext cx="633600" cy="147600"/>
-                            </a:xfrm>
-                            <a:prstGeom prst="rect">
-                              <a:avLst/>
-                            </a:prstGeom>
-                            <a:solidFill>
-                              <a:schemeClr val="bg1"/>
-                            </a:solidFill>
-                            <a:ln w="6350">
-                              <a:noFill/>
-                            </a:ln>
-                          </wps:spPr>
-                          <wps:txbx>
-                            <w:txbxContent>
-                              <w:p>
-                                <w:pPr>
-                                  <w:spacing w:after="0" w:line="240" w:lineRule="auto"/>
-                                  <w:rPr>
-                                    <w:rFonts w:ascii="Sylfaen" w:hAnsi="Sylfaen"/>
-                                    <w:sz w:val="15"/>
-                                    <w:szCs w:val="15"/>
-                                  </w:rPr>
-                                </w:pPr>
-                                <w:r>
-                                  <w:rPr>
-                                    <w:rFonts w:ascii="Sylfaen" w:hAnsi="Sylfaen"/>
-                                    <w:sz w:val="15"/>
-                                    <w:szCs w:val="15"/>
-                                  </w:rPr>
-                                  <w:t>հաշվեհամար</w:t>
-                                </w:r>
-                              </w:p>
-                            </w:txbxContent>
-                          </wps:txbx>
-                          <wps:bodyPr rot="0" spcFirstLastPara="0" vertOverflow="overflow" horzOverflow="overflow" vert="horz" wrap="square" lIns="0" tIns="0" rIns="0" bIns="0" numCol="1" spcCol="0" rtlCol="0" fromWordArt="0" anchor="t" anchorCtr="0" forceAA="0" compatLnSpc="1">
-                            <a:prstTxWarp prst="textNoShape">
-                              <a:avLst/>
-                            </a:prstTxWarp>
-                            <a:noAutofit/>
-                          </wps:bodyPr>
-                        </wps:wsp>
-                        <wps:wsp>
-                          <wps:cNvPr id="38281565" name="Text Box 3"/>
-                          <wps:cNvSpPr txBox="1"/>
-                          <wps:spPr>
-                            <a:xfrm>
-                              <a:off x="1432091" y="602098"/>
-                              <a:ext cx="2265680" cy="300355"/>
-                            </a:xfrm>
-                            <a:prstGeom prst="rect">
-                              <a:avLst/>
-                            </a:prstGeom>
-                            <a:noFill/>
-                            <a:ln w="6350">
-                              <a:noFill/>
-                            </a:ln>
-                          </wps:spPr>
-                          <wps:txbx>
-                            <w:txbxContent>
-                              <w:p>
-                                <w:pPr>
-                                  <w:rPr>
-                                    <w:rFonts w:ascii="Sylfaen" w:hAnsi="Sylfaen"/>
-                                    <w:sz w:val="16"/>
-                                    <w:szCs w:val="16"/>
-                                  </w:rPr>
-                                </w:pPr>
-                                <w:r>
-                                  <w:rPr>
-                                    <w:rFonts w:ascii="Sylfaen" w:hAnsi="Sylfaen"/>
-                                    <w:sz w:val="16"/>
-                                    <w:szCs w:val="16"/>
-                                  </w:rPr>
-                                  <w:t>1570048872108700</w:t>
-                                </w:r>
-                              </w:p>
-                              <w:p>
-                                <w:pPr>
-                                  <w:rPr>
-                                    <w:rFonts w:ascii="Sylfaen" w:hAnsi="Sylfaen"/>
-                                    <w:sz w:val="18"/>
-                                    <w:szCs w:val="18"/>
-                                  </w:rPr>
-                                </w:pPr>
-                              </w:p>
-                            </w:txbxContent>
-                          </wps:txbx>
-                          <wps:bodyPr rot="0" spcFirstLastPara="0" vertOverflow="overflow" horzOverflow="overflow" vert="horz" wrap="square" lIns="91440" tIns="45720" rIns="91440" bIns="45720" numCol="1" spcCol="0" rtlCol="0" fromWordArt="0" anchor="t" anchorCtr="0" forceAA="0" compatLnSpc="1">
-                            <a:prstTxWarp prst="textNoShape">
-                              <a:avLst/>
-                            </a:prstTxWarp>
-                            <a:noAutofit/>
-                          </wps:bodyPr>
-                        </wps:wsp>
-                        <wps:wsp>
-                          <wps:cNvPr id="973662" name="Text Box 4"/>
-                          <wps:cNvSpPr txBox="1"/>
-                          <wps:spPr>
-                            <a:xfrm>
-                              <a:off x="1319550" y="146304"/>
-                              <a:ext cx="2501152" cy="328595"/>
-                            </a:xfrm>
-                            <a:prstGeom prst="rect">
-                              <a:avLst/>
-                            </a:prstGeom>
-                            <a:noFill/>
-                            <a:ln w="6350"/>
-                          </wps:spPr>
-                          <wps:style>
-                            <a:lnRef idx="2">
-                              <a:schemeClr val="dk1"/>
-                            </a:lnRef>
-                            <a:fillRef idx="1">
-                              <a:schemeClr val="lt1"/>
-                            </a:fillRef>
-                            <a:effectRef idx="0">
-                              <a:schemeClr val="dk1"/>
-                            </a:effectRef>
-                            <a:fontRef idx="minor">
-                              <a:schemeClr val="dk1"/>
-                            </a:fontRef>
-                          </wps:style>
-                          <wps:txbx>
-                            <w:txbxContent>
-                              <w:p/>
-                            </w:txbxContent>
-                          </wps:txbx>
-                          <wps:bodyPr rot="0" spcFirstLastPara="0" vertOverflow="overflow" horzOverflow="overflow" vert="horz" wrap="square" lIns="91440" tIns="45720" rIns="91440" bIns="45720" numCol="1" spcCol="0" rtlCol="0" fromWordArt="0" anchor="t" anchorCtr="0" forceAA="0" compatLnSpc="1">
-                            <a:prstTxWarp prst="textNoShape">
-                              <a:avLst/>
-                            </a:prstTxWarp>
-                            <a:noAutofit/>
-                          </wps:bodyPr>
-                        </wps:wsp>
-                        <wps:wsp>
-                          <wps:cNvPr id="1376187725" name="Text Box 4"/>
-                          <wps:cNvSpPr txBox="1"/>
-                          <wps:spPr>
-                            <a:xfrm>
-                              <a:off x="0" y="151931"/>
-                              <a:ext cx="1323280" cy="328595"/>
-                            </a:xfrm>
-                            <a:prstGeom prst="rect">
-                              <a:avLst/>
-                            </a:prstGeom>
-                            <a:noFill/>
-                            <a:ln w="6350">
-                              <a:solidFill>
-                                <a:schemeClr val="dk1"/>
-                              </a:solidFill>
-                            </a:ln>
-                          </wps:spPr>
-                          <wps:style>
-                            <a:lnRef idx="2">
-                              <a:schemeClr val="dk1"/>
-                            </a:lnRef>
-                            <a:fillRef idx="1">
-                              <a:schemeClr val="lt1"/>
-                            </a:fillRef>
-                            <a:effectRef idx="0">
-                              <a:schemeClr val="dk1"/>
-                            </a:effectRef>
-                            <a:fontRef idx="minor">
-                              <a:schemeClr val="dk1"/>
-                            </a:fontRef>
-                          </wps:style>
-                          <wps:txbx>
-                            <w:txbxContent>
-                              <w:p/>
-                            </w:txbxContent>
-                          </wps:txbx>
-                          <wps:bodyPr rot="0" spcFirstLastPara="0" vertOverflow="overflow" horzOverflow="overflow" vert="horz" wrap="square" lIns="91440" tIns="45720" rIns="91440" bIns="45720" numCol="1" spcCol="0" rtlCol="0" fromWordArt="0" anchor="t" anchorCtr="0" forceAA="0" compatLnSpc="1">
-                            <a:prstTxWarp prst="textNoShape">
-                              <a:avLst/>
-                            </a:prstTxWarp>
-                            <a:noAutofit/>
-                          </wps:bodyPr>
-                        </wps:wsp>
-                        <wps:wsp>
-                          <wps:cNvPr id="1564361071" name="Text Box 3"/>
-                          <wps:cNvSpPr txBox="1"/>
-                          <wps:spPr>
-                            <a:xfrm>
-                              <a:off x="109728" y="5627"/>
-                              <a:ext cx="584174" cy="260719"/>
-                            </a:xfrm>
-                            <a:prstGeom prst="rect">
-                              <a:avLst/>
-                            </a:prstGeom>
-                            <a:solidFill>
-                              <a:schemeClr val="bg1"/>
-                            </a:solidFill>
-                            <a:ln w="6350">
-                              <a:noFill/>
-                            </a:ln>
-                          </wps:spPr>
-                          <wps:txbx>
-                            <w:txbxContent>
-                              <w:p>
-                                <w:pPr>
-                                  <w:rPr>
-                                    <w:rFonts w:ascii="Sylfaen" w:hAnsi="Sylfaen"/>
-                                    <w:sz w:val="15"/>
-                                    <w:szCs w:val="15"/>
-                                  </w:rPr>
-                                </w:pPr>
-                                <w:r>
-                                  <w:rPr>
-                                    <w:rFonts w:ascii="Sylfaen" w:hAnsi="Sylfaen"/>
-                                    <w:sz w:val="15"/>
-                                    <w:szCs w:val="15"/>
-                                  </w:rPr>
-                                  <w:t>գումար</w:t>
-                                </w:r>
-                              </w:p>
-                            </w:txbxContent>
-                          </wps:txbx>
-                          <wps:bodyPr rot="0" spcFirstLastPara="0" vertOverflow="overflow" horzOverflow="overflow" vert="horz" wrap="square" lIns="91440" tIns="45720" rIns="91440" bIns="45720" numCol="1" spcCol="0" rtlCol="0" fromWordArt="0" anchor="t" anchorCtr="0" forceAA="0" compatLnSpc="1">
-                            <a:prstTxWarp prst="textNoShape">
-                              <a:avLst/>
-                            </a:prstTxWarp>
-                            <a:noAutofit/>
-                          </wps:bodyPr>
-                        </wps:wsp>
-                        <wps:wsp>
-                          <wps:cNvPr id="450079714" name="Text Box 3"/>
-                          <wps:cNvSpPr txBox="1"/>
-                          <wps:spPr>
-                            <a:xfrm>
-                              <a:off x="1423651" y="0"/>
-                              <a:ext cx="1166442" cy="260719"/>
-                            </a:xfrm>
-                            <a:prstGeom prst="rect">
-                              <a:avLst/>
-                            </a:prstGeom>
-                            <a:solidFill>
-                              <a:schemeClr val="bg1"/>
-                            </a:solidFill>
-                            <a:ln w="6350">
-                              <a:noFill/>
-                            </a:ln>
-                          </wps:spPr>
-                          <wps:txbx>
-                            <w:txbxContent>
-                              <w:p>
-                                <w:pPr>
-                                  <w:rPr>
-                                    <w:rFonts w:ascii="Sylfaen" w:hAnsi="Sylfaen"/>
-                                    <w:sz w:val="15"/>
-                                    <w:szCs w:val="15"/>
-                                  </w:rPr>
-                                </w:pPr>
-                                <w:r>
-                                  <w:rPr>
-                                    <w:rFonts w:ascii="Sylfaen" w:hAnsi="Sylfaen"/>
-                                    <w:sz w:val="15"/>
-                                    <w:szCs w:val="15"/>
-                                  </w:rPr>
-                                  <w:t>գումարը բառերով</w:t>
-                                </w:r>
-                              </w:p>
-                            </w:txbxContent>
-                          </wps:txbx>
-                          <wps:bodyPr rot="0" spcFirstLastPara="0" vertOverflow="overflow" horzOverflow="overflow" vert="horz" wrap="square" lIns="91440" tIns="45720" rIns="91440" bIns="45720" numCol="1" spcCol="0" rtlCol="0" fromWordArt="0" anchor="t" anchorCtr="0" forceAA="0" compatLnSpc="1">
-                            <a:prstTxWarp prst="textNoShape">
-                              <a:avLst/>
-                            </a:prstTxWarp>
-                            <a:noAutofit/>
-                          </wps:bodyPr>
-                        </wps:wsp>
-                      </wpg:grpSp>
-                    </wpg:wgp>
-                  </a:graphicData>
-                </a:graphic>
-              </wp:anchor>
-            </w:drawing>
-          </mc:Choice>
-          <mc:Fallback>
-            <w:pict>
-              <v:group w14:anchorId="362F763F" id="_x0000_s1047" style="position:absolute;left:0;text-align:left;margin-left:-65.75pt;margin-top:186.75pt;width:624.6pt;height:216.9pt;z-index:251773440" coordsize="79324,27546" o:gfxdata="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">
-                <v:line id="Straight Connector 1" o:spid="_x0000_s1048" style="position:absolute;flip:x;visibility:visible;mso-wrap-style:square" from="53,1497" to="368,27540" o:connectortype="straight" o:gfxdata="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" strokecolor="black [3200]" strokeweight=".5pt">
-                  <v:shadow on="t" color="black" opacity="24903f" origin=",.5" offset="0,.55556mm"/>
-                </v:line>
-                <v:line id="Straight Connector 1" o:spid="_x0000_s1049" style="position:absolute;visibility:visible;mso-wrap-style:square" from="69401,1351" to="69435,27546" o:connectortype="straight" o:gfxdata="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" strokecolor="black [3200]" strokeweight=".5pt">
-                  <v:shadow on="t" color="black" opacity="24903f" origin=",.5" offset="0,.55556mm"/>
-                </v:line>
-                <v:line id="Straight Connector 1" o:spid="_x0000_s1050" style="position:absolute;flip:x;visibility:visible;mso-wrap-style:square" from="0,27539" to="69373,27539" o:connectortype="straight" o:gfxdata="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" strokecolor="black [3200]" strokeweight=".5pt">
-                  <v:shadow on="t" color="black" opacity="24903f" origin=",.5" offset="0,.55556mm"/>
-                </v:line>
-                <v:line id="Straight Connector 1" o:spid="_x0000_s1051" style="position:absolute;flip:x;visibility:visible;mso-wrap-style:square" from="365,1497" to="22215,1497" o:connectortype="straight" o:gfxdata="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" strokecolor="black [3200]" strokeweight=".5pt">
-                  <v:shadow on="t" color="black" opacity="24903f" origin=",.5" offset="0,.55556mm"/>
-                </v:line>
-                <v:line id="Straight Connector 1" o:spid="_x0000_s1052" style="position:absolute;flip:x;visibility:visible;mso-wrap-style:square" from="48461,1278" to="69594,1343" o:connectortype="straight" o:gfxdata="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" strokecolor="black [3200]" strokeweight=".5pt">
-                  <v:shadow on="t" color="black" opacity="24903f" origin=",.5" offset="0,.55556mm"/>
-                </v:line>
-                <v:shape id="_x0000_s1053" type="#_x0000_t202" style="position:absolute;left:23520;width:24879;height:3009;visibility:visible;mso-wrap-style:square;v-text-anchor:top" o:gfxdata="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" filled="f" stroked="f" strokeweight=".5pt">
-                  <v:textbox>
-                    <w:txbxContent>
-                      <w:p>
-                        <w:pPr>
-                          <w:rPr>
-                            <w:rFonts w:ascii="Sylfaen" w:hAnsi="Sylfaen"/>
-                            <w:sz w:val="20"/>
-                            <w:szCs w:val="20"/>
-                          </w:rPr>
-                        </w:pPr>
-                        <w:r>
-                          <w:rPr>
-                            <w:rFonts w:ascii="Sylfaen" w:hAnsi="Sylfaen"/>
-                            <w:sz w:val="20"/>
-                            <w:szCs w:val="20"/>
-                          </w:rPr>
-                          <w:t>ԱՆ</w:t>
-                        </w:r>
-                        <w:r>
-                          <w:rPr>
-                            <w:rFonts w:ascii="Sylfaen" w:hAnsi="Sylfaen"/>
-                            <w:sz w:val="20"/>
-                            <w:szCs w:val="20"/>
-                          </w:rPr>
-                          <w:t xml:space="preserve">ԿԱՆԽԻԿ ՄՈՒՏՔԻ </w:t>
-                        </w:r>
-                        <w:r>
-                          <w:rPr>
-                            <w:rFonts w:ascii="Sylfaen" w:hAnsi="Sylfaen"/>
-                            <w:sz w:val="20"/>
-                            <w:szCs w:val="20"/>
-                          </w:rPr>
-                          <w:t>ԱՆԴՈՐՐԱԳԻՐ</w:t>
-                        </w:r>
-                      </w:p>
-                    </w:txbxContent>
-                  </v:textbox>
-                </v:shape>
-                <v:shape id="_x0000_s1054" type="#_x0000_t202" style="position:absolute;left:916;top:1828;width:20609;height:3014;visibility:visible;mso-wrap-style:square;v-text-anchor:top" o:gfxdata="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" filled="f" stroked="f" strokeweight=".5pt">
-                  <v:textbox>
-                    <w:txbxContent>
-                      <w:p>
-                        <w:pPr>
-                          <w:rPr>
-                            <w:rFonts w:ascii="Sylfaen" w:hAnsi="Sylfaen"/>
-                            <w:sz w:val="18"/>
-                            <w:szCs w:val="18"/>
-                          </w:rPr>
-                        </w:pPr>
-                        <w:r>
-                          <w:rPr>
-                            <w:rFonts w:ascii="Sylfaen" w:hAnsi="Sylfaen"/>
-                            <w:sz w:val="18"/>
-                            <w:szCs w:val="18"/>
-                          </w:rPr>
-                          <w:t xml:space="preserve">«ԱԿՐԵԴԻՏ» ՎՄ ՍՊԸ  </w:t>
-                        </w:r>
-                      </w:p>
-                    </w:txbxContent>
-                  </v:textbox>
-                </v:shape>
-                <v:shape id="_x0000_s1055" type="#_x0000_t202" style="position:absolute;left:56658;top:1755;width:22666;height:3010;visibility:visible;mso-wrap-style:square;v-text-anchor:top" o:gfxdata="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" filled="f" stroked="f" strokeweight=".5pt">
-                  <v:textbox>
-                    <w:txbxContent>
-                      <w:p>
-                        <w:pPr>
-                          <w:rPr>
-                            <w:rFonts w:ascii="Sylfaen" w:hAnsi="Sylfaen"/>
-                            <w:sz w:val="18"/>
-                            <w:szCs w:val="18"/>
-                          </w:rPr>
-                        </w:pPr>
-                        <w:r>
-                          <w:rPr>
-                            <w:rFonts w:ascii="Sylfaen" w:hAnsi="Sylfaen"/>
-                            <w:sz w:val="18"/>
-                            <w:szCs w:val="18"/>
-                          </w:rPr>
-                          <w:t>ՀԱՄԱՐ՝ XX_XXXXX</w:t>
-                        </w:r>
-                      </w:p>
-                    </w:txbxContent>
-                  </v:textbox>
-                </v:shape>
-                <v:shape id="_x0000_s1056" type="#_x0000_t202" style="position:absolute;left:51171;top:23993;width:20606;height:3010;visibility:visible;mso-wrap-style:square;v-text-anchor:top" o:gfxdata="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" filled="f" stroked="f" strokeweight=".5pt">
-                  <v:textbox>
-                    <w:txbxContent>
-                      <w:p>
-                        <w:pPr>
-                          <w:rPr>
-                            <w:rFonts w:ascii="Sylfaen" w:hAnsi="Sylfaen"/>
-                            <w:sz w:val="18"/>
-                            <w:szCs w:val="18"/>
-                          </w:rPr>
-                        </w:pPr>
-                        <w:r>
-                          <w:rPr>
-                            <w:rFonts w:ascii="Sylfaen" w:hAnsi="Sylfaen"/>
-                            <w:sz w:val="18"/>
-                            <w:szCs w:val="18"/>
-                          </w:rPr>
-                          <w:t xml:space="preserve">Ամսաթիվ՝ </w:t>
-                        </w:r>
-                        <w:r>
-                          <w:rPr>
-                            <w:rFonts w:ascii="Times New Roman" w:eastAsia="Times New Roman" w:hAnsi="Times New Roman" w:cs="Times New Roman"/>
-                            <w:color w:val="000000" w:themeColor="text1"/>
-                            <w:sz w:val="18"/>
-                            <w:szCs w:val="18"/>
-                            <w:lang w:val="en-GB"/>
-                          </w:rPr>
-                          <w:t>${date}</w:t>
-                        </w:r>
-                      </w:p>
-                    </w:txbxContent>
-                  </v:textbox>
-                </v:shape>
-                <v:shape id="_x0000_s1057" type="#_x0000_t202" style="position:absolute;left:51171;top:22091;width:11321;height:3010;visibility:visible;mso-wrap-style:square;v-text-anchor:top" o:gfxdata="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" filled="f" stroked="f" strokeweight=".5pt">
-                  <v:textbox>
-                    <w:txbxContent>
-                      <w:p>
-                        <w:pPr>
-                          <w:rPr>
-                            <w:rFonts w:ascii="Sylfaen" w:hAnsi="Sylfaen"/>
-                            <w:sz w:val="18"/>
-                            <w:szCs w:val="18"/>
-                          </w:rPr>
-                        </w:pPr>
-                        <w:r>
-                          <w:rPr>
-                            <w:rFonts w:ascii="Sylfaen" w:hAnsi="Sylfaen"/>
-                            <w:sz w:val="18"/>
-                            <w:szCs w:val="18"/>
-                          </w:rPr>
-                          <w:t>Կ. Տ.</w:t>
-                        </w:r>
-                      </w:p>
-                    </w:txbxContent>
-                  </v:textbox>
-                </v:shape>
-                <v:group id="Group 19" o:spid="_x0000_s1058" style="position:absolute;left:31128;top:5705;width:38258;height:9025" coordsize="38258,9024" o:gfxdata="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">
-                  <v:shape id="Text Box 4" o:spid="_x0000_s1059" type="#_x0000_t202" style="position:absolute;left:13251;top:4783;width:25007;height:3282;visibility:visible;mso-wrap-style:square;v-text-anchor:top" o:gfxdata="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" filled="f" strokecolor="black [3200]" strokeweight=".5pt">
-                    <v:textbox>
-                      <w:txbxContent>
-                        <w:p/>
-                      </w:txbxContent>
-                    </v:textbox>
-                  </v:shape>
-                  <v:shape id="_x0000_s1060" type="#_x0000_t202" style="position:absolute;left:15390;top:5036;width:6336;height:1476;visibility:visible;mso-wrap-style:square;v-text-anchor:top" o:gfxdata="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" fillcolor="white [3212]" stroked="f" strokeweight=".5pt">
-                    <v:textbox inset="0,0,0,0">
-                      <w:txbxContent>
-                        <w:p>
-                          <w:pPr>
-                            <w:spacing w:after="0" w:line="240" w:lineRule="auto"/>
-                            <w:rPr>
-                              <w:rFonts w:ascii="Sylfaen" w:hAnsi="Sylfaen"/>
-                              <w:sz w:val="15"/>
-                              <w:szCs w:val="15"/>
-                            </w:rPr>
-                          </w:pPr>
-                          <w:r>
-                            <w:rPr>
-                              <w:rFonts w:ascii="Sylfaen" w:hAnsi="Sylfaen"/>
-                              <w:sz w:val="15"/>
-                              <w:szCs w:val="15"/>
-                            </w:rPr>
-                            <w:t>հաշվեհամար</w:t>
-                          </w:r>
-                        </w:p>
-                      </w:txbxContent>
-                    </v:textbox>
-                  </v:shape>
-                  <v:shape id="_x0000_s1061" type="#_x0000_t202" style="position:absolute;left:14320;top:6020;width:22657;height:3004;visibility:visible;mso-wrap-style:square;v-text-anchor:top" o:gfxdata="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" filled="f" stroked="f" strokeweight=".5pt">
-                    <v:textbox>
-                      <w:txbxContent>
-                        <w:p>
-                          <w:pPr>
-                            <w:rPr>
-                              <w:rFonts w:ascii="Sylfaen" w:hAnsi="Sylfaen"/>
-                              <w:sz w:val="16"/>
-                              <w:szCs w:val="16"/>
-                            </w:rPr>
-                          </w:pPr>
-                          <w:r>
-                            <w:rPr>
-                              <w:rFonts w:ascii="Sylfaen" w:hAnsi="Sylfaen"/>
-                              <w:sz w:val="16"/>
-                              <w:szCs w:val="16"/>
-                            </w:rPr>
-                            <w:t>1570048872108700</w:t>
-                          </w:r>
-                        </w:p>
-                        <w:p>
-                          <w:pPr>
-                            <w:rPr>
-                              <w:rFonts w:ascii="Sylfaen" w:hAnsi="Sylfaen"/>
-                              <w:sz w:val="18"/>
-                              <w:szCs w:val="18"/>
-                            </w:rPr>
-                          </w:pPr>
-                        </w:p>
-                      </w:txbxContent>
-                    </v:textbox>
-                  </v:shape>
-                  <v:shape id="Text Box 4" o:spid="_x0000_s1062" type="#_x0000_t202" style="position:absolute;left:13195;top:1463;width:25012;height:3285;visibility:visible;mso-wrap-style:square;v-text-anchor:top" o:gfxdata="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" filled="f" strokecolor="black [3200]" strokeweight=".5pt">
-                    <v:textbox>
-                      <w:txbxContent>
-                        <w:p/>
-                      </w:txbxContent>
-                    </v:textbox>
-                  </v:shape>
-                  <v:shape id="Text Box 4" o:spid="_x0000_s1063" type="#_x0000_t202" style="position:absolute;top:1519;width:13232;height:3286;visibility:visible;mso-wrap-style:square;v-text-anchor:top" o:gfxdata="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" filled="f" strokecolor="black [3200]" strokeweight=".5pt">
-                    <v:textbox>
-                      <w:txbxContent>
-                        <w:p/>
-                      </w:txbxContent>
-                    </v:textbox>
-                  </v:shape>
-                  <v:shape id="_x0000_s1064" type="#_x0000_t202" style="position:absolute;left:1097;top:56;width:5842;height:2607;visibility:visible;mso-wrap-style:square;v-text-anchor:top" o:gfxdata="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" fillcolor="white [3212]" stroked="f" strokeweight=".5pt">
-                    <v:textbox>
-                      <w:txbxContent>
-                        <w:p>
-                          <w:pPr>
-                            <w:rPr>
-                              <w:rFonts w:ascii="Sylfaen" w:hAnsi="Sylfaen"/>
-                              <w:sz w:val="15"/>
-                              <w:szCs w:val="15"/>
-                            </w:rPr>
-                          </w:pPr>
-                          <w:r>
-                            <w:rPr>
-                              <w:rFonts w:ascii="Sylfaen" w:hAnsi="Sylfaen"/>
-                              <w:sz w:val="15"/>
-                              <w:szCs w:val="15"/>
-                            </w:rPr>
-                            <w:t>գումար</w:t>
-                          </w:r>
-                        </w:p>
-                      </w:txbxContent>
-                    </v:textbox>
-                  </v:shape>
-                  <v:shape id="_x0000_s1065" type="#_x0000_t202" style="position:absolute;left:14236;width:11664;height:2607;visibility:visible;mso-wrap-style:square;v-text-anchor:top" o:gfxdata="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" fillcolor="white [3212]" stroked="f" strokeweight=".5pt">
-                    <v:textbox>
-                      <w:txbxContent>
-                        <w:p>
-                          <w:pPr>
-                            <w:rPr>
-                              <w:rFonts w:ascii="Sylfaen" w:hAnsi="Sylfaen"/>
-                              <w:sz w:val="15"/>
-                              <w:szCs w:val="15"/>
-                            </w:rPr>
-                          </w:pPr>
-                          <w:r>
-                            <w:rPr>
-                              <w:rFonts w:ascii="Sylfaen" w:hAnsi="Sylfaen"/>
-                              <w:sz w:val="15"/>
-                              <w:szCs w:val="15"/>
-                            </w:rPr>
-                            <w:t>գումարը բառերով</w:t>
-                          </w:r>
-                        </w:p>
-                      </w:txbxContent>
-                    </v:textbox>
-                  </v:shape>
-                </v:group>
-              </v:group>
-            </w:pict>
-          </mc:Fallback>
-        </mc:AlternateContent>
-      </w:r>
-      <w:r>
-        <w:rPr>
-          <w:noProof/>
-          <w:sz w:val="20"/>
-          <w:szCs w:val="20"/>
-        </w:rPr>
-        <mc:AlternateContent>
           <mc:Choice Requires="wps">
             <w:drawing>
-              <wp:anchor distT="0" distB="0" distL="114300" distR="114300" simplePos="0" relativeHeight="251770368" behindDoc="0" locked="0" layoutInCell="1" allowOverlap="1" wp14:anchorId="1582A0D1" wp14:editId="10A97613">
+              <wp:anchor distT="0" distB="0" distL="114300" distR="114300" simplePos="0" relativeHeight="251770368" behindDoc="0" locked="0" layoutInCell="1" allowOverlap="1" wp14:anchorId="1582A0D1" wp14:editId="09ECA155">
                 <wp:simplePos x="0" y="0"/>
                 <wp:positionH relativeFrom="column">
                   <wp:posOffset>2414906</wp:posOffset>
@@ -2546,8 +1436,18 @@
                                 <w:sz w:val="16"/>
                                 <w:szCs w:val="16"/>
                               </w:rPr>
-                              <w:t xml:space="preserve"> ՀՀ դրամ</w:t>
+                              <w:t xml:space="preserve"> ՀՀ </w:t>
                             </w:r>
+                            <w:proofErr w:type="spellStart"/>
+                            <w:r>
+                              <w:rPr>
+                                <w:rFonts w:ascii="Sylfaen" w:hAnsi="Sylfaen"/>
+                                <w:sz w:val="16"/>
+                                <w:szCs w:val="16"/>
+                              </w:rPr>
+                              <w:t>դրամ</w:t>
+                            </w:r>
+                            <w:proofErr w:type="spellEnd"/>
                           </w:p>
                         </w:txbxContent>
                       </wps:txbx>
@@ -2565,7 +1465,7 @@
           </mc:Choice>
           <mc:Fallback>
             <w:pict>
-              <v:shape w14:anchorId="1582A0D1" id="_x0000_s1066" type="#_x0000_t202" style="position:absolute;left:0;text-align:left;margin-left:190.15pt;margin-top:7.9pt;width:178.45pt;height:23.7pt;z-index:251770368;visibility:visible;mso-wrap-style:square;mso-wrap-distance-left:9pt;mso-wrap-distance-top:0;mso-wrap-distance-right:9pt;mso-wrap-distance-bottom:0;mso-position-horizontal:absolute;mso-position-horizontal-relative:text;mso-position-vertical:absolute;mso-position-vertical-relative:text;v-text-anchor:top" o:gfxdata="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" filled="f" stroked="f" strokeweight=".5pt">
+              <v:shape w14:anchorId="1582A0D1" id="_x0000_s1047" type="#_x0000_t202" style="position:absolute;left:0;text-align:left;margin-left:190.15pt;margin-top:7.9pt;width:178.45pt;height:23.7pt;z-index:251770368;visibility:visible;mso-wrap-style:square;mso-wrap-distance-left:9pt;mso-wrap-distance-top:0;mso-wrap-distance-right:9pt;mso-wrap-distance-bottom:0;mso-position-horizontal:absolute;mso-position-horizontal-relative:text;mso-position-vertical:absolute;mso-position-vertical-relative:text;v-text-anchor:top" o:gfxdata="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" filled="f" stroked="f" strokeweight=".5pt">
                 <v:textbox>
                   <w:txbxContent>
                     <w:p>
@@ -2590,8 +1490,18 @@
                           <w:sz w:val="16"/>
                           <w:szCs w:val="16"/>
                         </w:rPr>
-                        <w:t xml:space="preserve"> ՀՀ դրամ</w:t>
+                        <w:t xml:space="preserve"> ՀՀ </w:t>
                       </w:r>
+                      <w:proofErr w:type="spellStart"/>
+                      <w:r>
+                        <w:rPr>
+                          <w:rFonts w:ascii="Sylfaen" w:hAnsi="Sylfaen"/>
+                          <w:sz w:val="16"/>
+                          <w:szCs w:val="16"/>
+                        </w:rPr>
+                        <w:t>դրամ</w:t>
+                      </w:r>
+                      <w:proofErr w:type="spellEnd"/>
                     </w:p>
                   </w:txbxContent>
                 </v:textbox>
@@ -2679,8 +1589,18 @@
                                 <w:sz w:val="16"/>
                                 <w:szCs w:val="16"/>
                               </w:rPr>
-                              <w:t xml:space="preserve"> ՀՀ դրամ</w:t>
+                              <w:t xml:space="preserve"> ՀՀ </w:t>
                             </w:r>
+                            <w:proofErr w:type="spellStart"/>
+                            <w:r>
+                              <w:rPr>
+                                <w:rFonts w:ascii="Sylfaen" w:hAnsi="Sylfaen"/>
+                                <w:sz w:val="16"/>
+                                <w:szCs w:val="16"/>
+                              </w:rPr>
+                              <w:t>դրամ</w:t>
+                            </w:r>
+                            <w:proofErr w:type="spellEnd"/>
                           </w:p>
                         </w:txbxContent>
                       </wps:txbx>
@@ -2698,7 +1618,7 @@
           </mc:Choice>
           <mc:Fallback>
             <w:pict>
-              <v:shape w14:anchorId="310CB9DE" id="_x0000_s1067" type="#_x0000_t202" style="position:absolute;left:0;text-align:left;margin-left:294.45pt;margin-top:7.9pt;width:178.45pt;height:23.7pt;z-index:251771392;visibility:visible;mso-wrap-style:square;mso-wrap-distance-left:9pt;mso-wrap-distance-top:0;mso-wrap-distance-right:9pt;mso-wrap-distance-bottom:0;mso-position-horizontal:absolute;mso-position-horizontal-relative:text;mso-position-vertical:absolute;mso-position-vertical-relative:text;v-text-anchor:top" o:gfxdata="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" filled="f" stroked="f" strokeweight=".5pt">
+              <v:shape w14:anchorId="310CB9DE" id="_x0000_s1048" type="#_x0000_t202" style="position:absolute;left:0;text-align:left;margin-left:294.45pt;margin-top:7.9pt;width:178.45pt;height:23.7pt;z-index:251771392;visibility:visible;mso-wrap-style:square;mso-wrap-distance-left:9pt;mso-wrap-distance-top:0;mso-wrap-distance-right:9pt;mso-wrap-distance-bottom:0;mso-position-horizontal:absolute;mso-position-horizontal-relative:text;mso-position-vertical:absolute;mso-position-vertical-relative:text;v-text-anchor:top" o:gfxdata="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" filled="f" stroked="f" strokeweight=".5pt">
                 <v:textbox>
                   <w:txbxContent>
                     <w:p>
@@ -2739,8 +1659,18 @@
                           <w:sz w:val="16"/>
                           <w:szCs w:val="16"/>
                         </w:rPr>
-                        <w:t xml:space="preserve"> ՀՀ դրամ</w:t>
+                        <w:t xml:space="preserve"> ՀՀ </w:t>
                       </w:r>
+                      <w:proofErr w:type="spellStart"/>
+                      <w:r>
+                        <w:rPr>
+                          <w:rFonts w:ascii="Sylfaen" w:hAnsi="Sylfaen"/>
+                          <w:sz w:val="16"/>
+                          <w:szCs w:val="16"/>
+                        </w:rPr>
+                        <w:t>դրամ</w:t>
+                      </w:r>
+                      <w:proofErr w:type="spellEnd"/>
                     </w:p>
                   </w:txbxContent>
                 </v:textbox>
@@ -2799,13 +1729,23 @@
         </w:rPr>
         <w:br/>
       </w:r>
+      <w:proofErr w:type="spellStart"/>
       <w:r>
         <w:rPr>
           <w:rFonts w:ascii="Sylfaen" w:hAnsi="Sylfaen"/>
           <w:sz w:val="20"/>
           <w:szCs w:val="20"/>
         </w:rPr>
-        <w:t xml:space="preserve">Պայմանագրի N </w:t>
+        <w:t>Պայմանագրի</w:t>
+      </w:r>
+      <w:proofErr w:type="spellEnd"/>
+      <w:r>
+        <w:rPr>
+          <w:rFonts w:ascii="Sylfaen" w:hAnsi="Sylfaen"/>
+          <w:sz w:val="20"/>
+          <w:szCs w:val="20"/>
+        </w:rPr>
+        <w:t xml:space="preserve"> N </w:t>
       </w:r>
       <w:r>
         <w:rPr>
@@ -2835,6 +1775,7 @@
         </w:rPr>
         <w:t>${</w:t>
       </w:r>
+      <w:proofErr w:type="spellStart"/>
       <w:r>
         <w:rPr>
           <w:rFonts w:ascii="Sylfaen" w:hAnsi="Sylfaen"/>
@@ -2846,6 +1787,7 @@
         </w:rPr>
         <w:t>num</w:t>
       </w:r>
+      <w:proofErr w:type="spellEnd"/>
       <w:r>
         <w:rPr>
           <w:rFonts w:ascii="Sylfaen" w:hAnsi="Sylfaen"/>
@@ -2865,13 +1807,23 @@
         </w:rPr>
         <w:br/>
       </w:r>
+      <w:proofErr w:type="spellStart"/>
       <w:r>
         <w:rPr>
           <w:rFonts w:ascii="Sylfaen" w:hAnsi="Sylfaen"/>
           <w:sz w:val="20"/>
           <w:szCs w:val="20"/>
         </w:rPr>
-        <w:t xml:space="preserve">Նպատակ </w:t>
+        <w:t>Նպատակ</w:t>
+      </w:r>
+      <w:proofErr w:type="spellEnd"/>
+      <w:r>
+        <w:rPr>
+          <w:rFonts w:ascii="Sylfaen" w:hAnsi="Sylfaen"/>
+          <w:sz w:val="20"/>
+          <w:szCs w:val="20"/>
+        </w:rPr>
+        <w:t xml:space="preserve"> </w:t>
       </w:r>
       <w:r>
         <w:rPr>
@@ -2898,6 +1850,7 @@
         </w:rPr>
         <w:br/>
       </w:r>
+      <w:proofErr w:type="spellStart"/>
       <w:r>
         <w:rPr>
           <w:rFonts w:ascii="Sylfaen" w:hAnsi="Sylfaen"/>
@@ -2906,6 +1859,7 @@
         </w:rPr>
         <w:t>Հիմք</w:t>
       </w:r>
+      <w:proofErr w:type="spellEnd"/>
       <w:r>
         <w:rPr>
           <w:rFonts w:ascii="Sylfaen" w:hAnsi="Sylfaen"/>
@@ -2946,7 +1900,24 @@
           <w:szCs w:val="20"/>
         </w:rPr>
         <w:br/>
-        <w:t xml:space="preserve">Կատարող՝ </w:t>
+      </w:r>
+      <w:proofErr w:type="spellStart"/>
+      <w:r>
+        <w:rPr>
+          <w:rFonts w:ascii="Sylfaen" w:hAnsi="Sylfaen"/>
+          <w:sz w:val="20"/>
+          <w:szCs w:val="20"/>
+        </w:rPr>
+        <w:t>Կատարող</w:t>
+      </w:r>
+      <w:proofErr w:type="spellEnd"/>
+      <w:r>
+        <w:rPr>
+          <w:rFonts w:ascii="Sylfaen" w:hAnsi="Sylfaen"/>
+          <w:sz w:val="20"/>
+          <w:szCs w:val="20"/>
+        </w:rPr>
+        <w:t xml:space="preserve">՝ </w:t>
       </w:r>
       <w:r>
         <w:rPr>
@@ -2963,275 +1934,6 @@
           <w:szCs w:val="20"/>
         </w:rPr>
         <w:br/>
-      </w:r>
-      <w:r>
-        <w:rPr>
-          <w:rFonts w:ascii="Sylfaen" w:hAnsi="Sylfaen"/>
-          <w:sz w:val="20"/>
-          <w:szCs w:val="20"/>
-        </w:rPr>
-        <w:br/>
-      </w:r>
-      <w:r>
-        <w:rPr>
-          <w:rFonts w:ascii="Sylfaen" w:hAnsi="Sylfaen"/>
-          <w:sz w:val="20"/>
-          <w:szCs w:val="20"/>
-        </w:rPr>
-        <w:br/>
-      </w:r>
-      <w:r>
-        <w:rPr>
-          <w:rFonts w:ascii="Sylfaen" w:hAnsi="Sylfaen"/>
-          <w:sz w:val="20"/>
-          <w:szCs w:val="20"/>
-        </w:rPr>
-        <w:br/>
-      </w:r>
-      <w:r>
-        <w:rPr>
-          <w:rFonts w:ascii="Sylfaen" w:hAnsi="Sylfaen"/>
-          <w:i/>
-          <w:iCs/>
-        </w:rPr>
-        <w:br/>
-      </w:r>
-      <w:r>
-        <w:rPr>
-          <w:rFonts w:ascii="Sylfaen" w:hAnsi="Sylfaen"/>
-          <w:i/>
-          <w:iCs/>
-        </w:rPr>
-        <w:br/>
-      </w:r>
-      <w:r>
-        <w:rPr>
-          <w:rFonts w:ascii="Sylfaen" w:hAnsi="Sylfaen"/>
-          <w:noProof/>
-          <w:sz w:val="20"/>
-          <w:szCs w:val="20"/>
-        </w:rPr>
-        <w:t>Մուտքագրող</w:t>
-      </w:r>
-      <w:r>
-        <w:rPr>
-          <w:rFonts w:ascii="Sylfaen" w:hAnsi="Sylfaen"/>
-          <w:sz w:val="21"/>
-          <w:szCs w:val="21"/>
-        </w:rPr>
-        <w:t xml:space="preserve"> </w:t>
-      </w:r>
-      <w:r>
-        <w:rPr>
-          <w:rFonts w:ascii="Sylfaen" w:hAnsi="Sylfaen"/>
-          <w:sz w:val="20"/>
-          <w:szCs w:val="20"/>
-        </w:rPr>
-        <w:br/>
-        <w:t xml:space="preserve">  </w:t>
-      </w:r>
-      <w:r>
-        <w:rPr>
-          <w:rFonts w:ascii="Sylfaen" w:hAnsi="Sylfaen"/>
-          <w:sz w:val="20"/>
-          <w:szCs w:val="20"/>
-        </w:rPr>
-        <w:t xml:space="preserve"> </w:t>
-      </w:r>
-      <w:r>
-        <w:rPr>
-          <w:rFonts w:ascii="Sylfaen" w:hAnsi="Sylfaen"/>
-          <w:b/>
-          <w:bCs/>
-          <w:i/>
-          <w:iCs/>
-          <w:sz w:val="20"/>
-          <w:szCs w:val="20"/>
-        </w:rPr>
-        <w:t>${</w:t>
-      </w:r>
-      <w:r>
-        <w:rPr>
-          <w:rFonts w:ascii="Sylfaen" w:hAnsi="Sylfaen"/>
-          <w:b/>
-          <w:bCs/>
-          <w:i/>
-          <w:iCs/>
-          <w:sz w:val="20"/>
-          <w:szCs w:val="20"/>
-        </w:rPr>
-        <w:t>client</w:t>
-      </w:r>
-      <w:r>
-        <w:rPr>
-          <w:rFonts w:ascii="Sylfaen" w:hAnsi="Sylfaen"/>
-          <w:b/>
-          <w:bCs/>
-          <w:i/>
-          <w:iCs/>
-          <w:sz w:val="20"/>
-          <w:szCs w:val="20"/>
-        </w:rPr>
-        <w:t>}</w:t>
-      </w:r>
-      <w:r>
-        <w:rPr>
-          <w:rFonts w:ascii="Sylfaen" w:hAnsi="Sylfaen"/>
-          <w:b/>
-          <w:bCs/>
-          <w:i/>
-          <w:iCs/>
-          <w:sz w:val="20"/>
-          <w:szCs w:val="20"/>
-        </w:rPr>
-        <w:br/>
-      </w:r>
-      <w:r>
-        <w:rPr>
-          <w:rFonts w:ascii="Sylfaen" w:hAnsi="Sylfaen"/>
-          <w:sz w:val="20"/>
-          <w:szCs w:val="20"/>
-        </w:rPr>
-        <w:t xml:space="preserve">Պայմանագրի N </w:t>
-      </w:r>
-      <w:r>
-        <w:rPr>
-          <w:rFonts w:ascii="Sylfaen" w:hAnsi="Sylfaen"/>
-        </w:rPr>
-        <w:br/>
-        <w:t xml:space="preserve">  </w:t>
-      </w:r>
-      <w:r>
-        <w:rPr>
-          <w:rFonts w:ascii="Sylfaen" w:hAnsi="Sylfaen"/>
-          <w:b/>
-          <w:bCs/>
-          <w:i/>
-          <w:iCs/>
-          <w:lang w:val="en-GB"/>
-        </w:rPr>
-        <w:t>${</w:t>
-      </w:r>
-      <w:r>
-        <w:rPr>
-          <w:rFonts w:ascii="Sylfaen" w:hAnsi="Sylfaen"/>
-          <w:b/>
-          <w:bCs/>
-          <w:i/>
-          <w:iCs/>
-          <w:lang w:val="en-GB"/>
-        </w:rPr>
-        <w:t>num</w:t>
-      </w:r>
-      <w:r>
-        <w:rPr>
-          <w:rFonts w:ascii="Sylfaen" w:hAnsi="Sylfaen"/>
-          <w:b/>
-          <w:bCs/>
-          <w:i/>
-          <w:iCs/>
-          <w:lang w:val="en-GB"/>
-        </w:rPr>
-        <w:t>}</w:t>
-      </w:r>
-      <w:r>
-        <w:rPr>
-          <w:rFonts w:ascii="Sylfaen" w:hAnsi="Sylfaen"/>
-          <w:i/>
-          <w:iCs/>
-        </w:rPr>
-        <w:br/>
-      </w:r>
-      <w:r>
-        <w:rPr>
-          <w:rFonts w:ascii="Sylfaen" w:hAnsi="Sylfaen"/>
-          <w:sz w:val="20"/>
-          <w:szCs w:val="20"/>
-        </w:rPr>
-        <w:t xml:space="preserve">Նպատակ </w:t>
-      </w:r>
-      <w:r>
-        <w:rPr>
-          <w:rFonts w:ascii="Sylfaen" w:hAnsi="Sylfaen"/>
-        </w:rPr>
-        <w:br/>
-        <w:t xml:space="preserve">  </w:t>
-      </w:r>
-      <w:r>
-        <w:rPr>
-          <w:rFonts w:ascii="Sylfaen" w:hAnsi="Sylfaen"/>
-          <w:b/>
-          <w:bCs/>
-          <w:i/>
-          <w:iCs/>
-        </w:rPr>
-        <w:t>${purpose}</w:t>
-      </w:r>
-      <w:r>
-        <w:rPr>
-          <w:rFonts w:ascii="Sylfaen" w:hAnsi="Sylfaen"/>
-          <w:i/>
-          <w:iCs/>
-        </w:rPr>
-        <w:br/>
-      </w:r>
-      <w:r>
-        <w:rPr>
-          <w:rFonts w:ascii="Sylfaen" w:hAnsi="Sylfaen"/>
-          <w:sz w:val="20"/>
-          <w:szCs w:val="20"/>
-        </w:rPr>
-        <w:t>Հիմք</w:t>
-      </w:r>
-      <w:r>
-        <w:rPr>
-          <w:rFonts w:ascii="Sylfaen" w:hAnsi="Sylfaen"/>
-        </w:rPr>
-        <w:br/>
-        <w:t xml:space="preserve">  </w:t>
-      </w:r>
-      <w:r>
-        <w:rPr>
-          <w:rFonts w:ascii="Sylfaen" w:hAnsi="Sylfaen"/>
-          <w:b/>
-          <w:bCs/>
-        </w:rPr>
-        <w:t>$</w:t>
-      </w:r>
-      <w:r>
-        <w:rPr>
-          <w:rFonts w:ascii="Sylfaen" w:hAnsi="Sylfaen"/>
-          <w:b/>
-          <w:bCs/>
-          <w:i/>
-          <w:iCs/>
-        </w:rPr>
-        <w:t>{basis}</w:t>
-      </w:r>
-      <w:r>
-        <w:rPr>
-          <w:rFonts w:ascii="Sylfaen" w:hAnsi="Sylfaen"/>
-          <w:i/>
-          <w:iCs/>
-        </w:rPr>
-        <w:br/>
-      </w:r>
-      <w:r>
-        <w:rPr>
-          <w:rFonts w:ascii="Sylfaen" w:hAnsi="Sylfaen"/>
-          <w:sz w:val="20"/>
-          <w:szCs w:val="20"/>
-        </w:rPr>
-        <w:br/>
-        <w:t xml:space="preserve">Կատարող՝ </w:t>
-      </w:r>
-      <w:r>
-        <w:rPr>
-          <w:rFonts w:ascii="Sylfaen" w:hAnsi="Sylfaen"/>
-          <w:sz w:val="20"/>
-          <w:szCs w:val="20"/>
-        </w:rPr>
-        <w:t>${executor}</w:t>
       </w:r>
     </w:p>
     <w:sectPr>

</xml_diff>